<commit_message>
Added Proj Setup in  doc
</commit_message>
<xml_diff>
--- a/Install_Spring_Boot_support_VSCode/Install_Spring_Boot_support_VSCode.docx
+++ b/Install_Spring_Boot_support_VSCode/Install_Spring_Boot_support_VSCode.docx
@@ -7,12 +7,20 @@
         <w:rPr>
           <w:b/>
           <w:bCs/>
-        </w:rPr>
-      </w:pPr>
-      <w:r>
-        <w:rPr>
-          <w:b/>
-          <w:bCs/>
+          <w:color w:val="FF0000"/>
+          <w:sz w:val="28"/>
+          <w:szCs w:val="28"/>
+          <w:u w:val="single"/>
+        </w:rPr>
+      </w:pPr>
+      <w:r>
+        <w:rPr>
+          <w:b/>
+          <w:bCs/>
+          <w:color w:val="FF0000"/>
+          <w:sz w:val="28"/>
+          <w:szCs w:val="28"/>
+          <w:u w:val="single"/>
         </w:rPr>
         <w:t>Install Spring Boot support in Visual Studio Code</w:t>
       </w:r>
@@ -45,15 +53,7 @@
         </w:numPr>
       </w:pPr>
       <w:r>
-        <w:t xml:space="preserve">big editing area in </w:t>
-      </w:r>
-      <w:proofErr w:type="spellStart"/>
-      <w:r>
-        <w:t>center</w:t>
-      </w:r>
-      <w:proofErr w:type="spellEnd"/>
-      <w:r>
-        <w:t xml:space="preserve"> </w:t>
+        <w:t xml:space="preserve">big editing area in center </w:t>
       </w:r>
     </w:p>
     <w:p>
@@ -492,7 +492,13 @@
     </w:p>
     <w:p>
       <w:r>
-        <w:t>Small command box opens at TOP.</w:t>
+        <w:t xml:space="preserve">Small command </w:t>
+      </w:r>
+      <w:r>
+        <w:t xml:space="preserve">search </w:t>
+      </w:r>
+      <w:r>
+        <w:t>box opens at TOP.</w:t>
       </w:r>
     </w:p>
     <w:p>
@@ -502,13 +508,8 @@
     </w:p>
     <w:p>
       <w:r>
-        <w:t xml:space="preserve">Spring </w:t>
-      </w:r>
-      <w:proofErr w:type="spellStart"/>
-      <w:r>
-        <w:t>Initializr</w:t>
-      </w:r>
-      <w:proofErr w:type="spellEnd"/>
+        <w:t>Spring Initializr</w:t>
+      </w:r>
     </w:p>
     <w:p>
       <w:r>
@@ -517,15 +518,7 @@
     </w:p>
     <w:p>
       <w:r>
-        <w:t xml:space="preserve">Spring </w:t>
-      </w:r>
-      <w:proofErr w:type="spellStart"/>
-      <w:r>
-        <w:t>Initializr</w:t>
-      </w:r>
-      <w:proofErr w:type="spellEnd"/>
-      <w:r>
-        <w:t>: Create a Maven Project</w:t>
+        <w:t>Spring Initializr: Create a Maven Project</w:t>
       </w:r>
     </w:p>
     <w:p>
@@ -659,11 +652,9 @@
       </w:r>
     </w:p>
     <w:p>
-      <w:proofErr w:type="spellStart"/>
       <w:r>
         <w:t>com.airline</w:t>
       </w:r>
-      <w:proofErr w:type="spellEnd"/>
     </w:p>
     <w:p>
       <w:pPr>
@@ -951,15 +942,7 @@
           <w:bCs/>
           <w:u w:val="single"/>
         </w:rPr>
-        <w:t xml:space="preserve">WHY </w:t>
-      </w:r>
-      <w:r>
-        <w:rPr>
-          <w:b/>
-          <w:bCs/>
-          <w:u w:val="single"/>
-        </w:rPr>
-        <w:t>Extension Pack for Java</w:t>
+        <w:t>WHY Extension Pack for Java</w:t>
       </w:r>
     </w:p>
     <w:p>
@@ -1039,21 +1022,13 @@
         </w:numPr>
       </w:pPr>
       <w:r>
-        <w:t xml:space="preserve">show Spring </w:t>
-      </w:r>
-      <w:proofErr w:type="spellStart"/>
-      <w:r>
-        <w:t>Initializr</w:t>
-      </w:r>
-      <w:proofErr w:type="spellEnd"/>
-      <w:r>
-        <w:t xml:space="preserve"> options </w:t>
+        <w:t xml:space="preserve">show Spring Initializr options </w:t>
       </w:r>
     </w:p>
     <w:p>
       <w:r>
         <w:pict w14:anchorId="2B5A3061">
-          <v:rect id="_x0000_i1169" style="width:0;height:1.5pt" o:hralign="center" o:hrstd="t" o:hr="t" fillcolor="#a0a0a0" stroked="f"/>
+          <v:rect id="_x0000_i1037" style="width:0;height:1.5pt" o:hralign="center" o:hrstd="t" o:hr="t" fillcolor="#a0a0a0" stroked="f"/>
         </w:pict>
       </w:r>
     </w:p>
@@ -1094,21 +1069,13 @@
     </w:p>
     <w:p>
       <w:r>
-        <w:t xml:space="preserve">Like Notepad with </w:t>
-      </w:r>
-      <w:proofErr w:type="spellStart"/>
-      <w:r>
-        <w:t>colors</w:t>
-      </w:r>
-      <w:proofErr w:type="spellEnd"/>
-      <w:r>
-        <w:t>.</w:t>
+        <w:t>Like Notepad with colors.</w:t>
       </w:r>
     </w:p>
     <w:p>
       <w:r>
         <w:pict w14:anchorId="3DFEBBDA">
-          <v:rect id="_x0000_i1170" style="width:0;height:1.5pt" o:hralign="center" o:hrstd="t" o:hr="t" fillcolor="#a0a0a0" stroked="f"/>
+          <v:rect id="_x0000_i1038" style="width:0;height:1.5pt" o:hralign="center" o:hrstd="t" o:hr="t" fillcolor="#a0a0a0" stroked="f"/>
         </w:pict>
       </w:r>
     </w:p>
@@ -1174,7 +1141,7 @@
     <w:p>
       <w:r>
         <w:pict w14:anchorId="70796007">
-          <v:rect id="_x0000_i1171" style="width:0;height:1.5pt" o:hralign="center" o:hrstd="t" o:hr="t" fillcolor="#a0a0a0" stroked="f"/>
+          <v:rect id="_x0000_i1039" style="width:0;height:1.5pt" o:hralign="center" o:hrstd="t" o:hr="t" fillcolor="#a0a0a0" stroked="f"/>
         </w:pict>
       </w:r>
     </w:p>
@@ -1299,7 +1266,7 @@
     <w:p>
       <w:r>
         <w:pict w14:anchorId="7B65D178">
-          <v:rect id="_x0000_i1172" style="width:0;height:1.5pt" o:hralign="center" o:hrstd="t" o:hr="t" fillcolor="#a0a0a0" stroked="f"/>
+          <v:rect id="_x0000_i1040" style="width:0;height:1.5pt" o:hralign="center" o:hrstd="t" o:hr="t" fillcolor="#a0a0a0" stroked="f"/>
         </w:pict>
       </w:r>
     </w:p>
@@ -1367,7 +1334,7 @@
     <w:p>
       <w:r>
         <w:pict w14:anchorId="0C21DC36">
-          <v:rect id="_x0000_i1173" style="width:0;height:1.5pt" o:hralign="center" o:hrstd="t" o:hr="t" fillcolor="#a0a0a0" stroked="f"/>
+          <v:rect id="_x0000_i1041" style="width:0;height:1.5pt" o:hralign="center" o:hrstd="t" o:hr="t" fillcolor="#a0a0a0" stroked="f"/>
         </w:pict>
       </w:r>
     </w:p>
@@ -1412,7 +1379,7 @@
     <w:p>
       <w:r>
         <w:pict w14:anchorId="0A09C196">
-          <v:rect id="_x0000_i1174" style="width:0;height:1.5pt" o:hralign="center" o:hrstd="t" o:hr="t" fillcolor="#a0a0a0" stroked="f"/>
+          <v:rect id="_x0000_i1042" style="width:0;height:1.5pt" o:hralign="center" o:hrstd="t" o:hr="t" fillcolor="#a0a0a0" stroked="f"/>
         </w:pict>
       </w:r>
     </w:p>
@@ -1481,7 +1448,7 @@
       <w:r>
         <w:lastRenderedPageBreak/>
         <w:pict w14:anchorId="33545349">
-          <v:rect id="_x0000_i1175" style="width:0;height:1.5pt" o:hralign="center" o:hrstd="t" o:hr="t" fillcolor="#a0a0a0" stroked="f"/>
+          <v:rect id="_x0000_i1043" style="width:0;height:1.5pt" o:hralign="center" o:hrstd="t" o:hr="t" fillcolor="#a0a0a0" stroked="f"/>
         </w:pict>
       </w:r>
     </w:p>
@@ -1533,7 +1500,7 @@
     <w:p>
       <w:r>
         <w:pict w14:anchorId="450BEF69">
-          <v:rect id="_x0000_i1176" style="width:0;height:1.5pt" o:hralign="center" o:hrstd="t" o:hr="t" fillcolor="#a0a0a0" stroked="f"/>
+          <v:rect id="_x0000_i1044" style="width:0;height:1.5pt" o:hralign="center" o:hrstd="t" o:hr="t" fillcolor="#a0a0a0" stroked="f"/>
         </w:pict>
       </w:r>
     </w:p>
@@ -1596,7 +1563,7 @@
     <w:p>
       <w:r>
         <w:pict w14:anchorId="75EC6B74">
-          <v:rect id="_x0000_i1177" style="width:0;height:1.5pt" o:hralign="center" o:hrstd="t" o:hr="t" fillcolor="#a0a0a0" stroked="f"/>
+          <v:rect id="_x0000_i1045" style="width:0;height:1.5pt" o:hralign="center" o:hrstd="t" o:hr="t" fillcolor="#a0a0a0" stroked="f"/>
         </w:pict>
       </w:r>
     </w:p>
@@ -1835,7 +1802,7 @@
     <w:p>
       <w:r>
         <w:pict w14:anchorId="09E338F4">
-          <v:rect id="_x0000_i1178" style="width:0;height:1.5pt" o:hralign="center" o:hrstd="t" o:hr="t" fillcolor="#a0a0a0" stroked="f"/>
+          <v:rect id="_x0000_i1046" style="width:0;height:1.5pt" o:hralign="center" o:hrstd="t" o:hr="t" fillcolor="#a0a0a0" stroked="f"/>
         </w:pict>
       </w:r>
     </w:p>
@@ -1905,15 +1872,7 @@
         </w:numPr>
       </w:pPr>
       <w:r>
-        <w:t xml:space="preserve">basic syntax </w:t>
-      </w:r>
-      <w:proofErr w:type="spellStart"/>
-      <w:r>
-        <w:t>colors</w:t>
-      </w:r>
-      <w:proofErr w:type="spellEnd"/>
-      <w:r>
-        <w:t xml:space="preserve"> </w:t>
+        <w:t xml:space="preserve">basic syntax colors </w:t>
       </w:r>
     </w:p>
     <w:p>
@@ -1984,7 +1943,7 @@
     <w:p>
       <w:r>
         <w:pict w14:anchorId="6D0CAD33">
-          <v:rect id="_x0000_i1179" style="width:0;height:1.5pt" o:hralign="center" o:hrstd="t" o:hr="t" fillcolor="#a0a0a0" stroked="f"/>
+          <v:rect id="_x0000_i1047" style="width:0;height:1.5pt" o:hralign="center" o:hrstd="t" o:hr="t" fillcolor="#a0a0a0" stroked="f"/>
         </w:pict>
       </w:r>
     </w:p>
@@ -2114,7 +2073,7 @@
     <w:p>
       <w:r>
         <w:pict w14:anchorId="1A5D5F16">
-          <v:rect id="_x0000_i1180" style="width:0;height:1.5pt" o:hralign="center" o:hrstd="t" o:hr="t" fillcolor="#a0a0a0" stroked="f"/>
+          <v:rect id="_x0000_i1048" style="width:0;height:1.5pt" o:hralign="center" o:hrstd="t" o:hr="t" fillcolor="#a0a0a0" stroked="f"/>
         </w:pict>
       </w:r>
     </w:p>
@@ -2162,7 +2121,7 @@
       <w:r>
         <w:lastRenderedPageBreak/>
         <w:pict w14:anchorId="0B1595A7">
-          <v:rect id="_x0000_i1181" style="width:0;height:1.5pt" o:hralign="center" o:hrstd="t" o:hr="t" fillcolor="#a0a0a0" stroked="f"/>
+          <v:rect id="_x0000_i1049" style="width:0;height:1.5pt" o:hralign="center" o:hrstd="t" o:hr="t" fillcolor="#a0a0a0" stroked="f"/>
         </w:pict>
       </w:r>
     </w:p>
@@ -2194,7 +2153,7 @@
     <w:p>
       <w:r>
         <w:pict w14:anchorId="561AE628">
-          <v:rect id="_x0000_i1182" style="width:0;height:1.5pt" o:hralign="center" o:hrstd="t" o:hr="t" fillcolor="#a0a0a0" stroked="f"/>
+          <v:rect id="_x0000_i1050" style="width:0;height:1.5pt" o:hralign="center" o:hrstd="t" o:hr="t" fillcolor="#a0a0a0" stroked="f"/>
         </w:pict>
       </w:r>
     </w:p>
@@ -2327,7 +2286,7 @@
     <w:p>
       <w:r>
         <w:pict w14:anchorId="60FC791A">
-          <v:rect id="_x0000_i1183" style="width:0;height:1.5pt" o:hralign="center" o:hrstd="t" o:hr="t" fillcolor="#a0a0a0" stroked="f"/>
+          <v:rect id="_x0000_i1051" style="width:0;height:1.5pt" o:hralign="center" o:hrstd="t" o:hr="t" fillcolor="#a0a0a0" stroked="f"/>
         </w:pict>
       </w:r>
     </w:p>
@@ -2386,23 +2345,7 @@
     </w:p>
     <w:p>
       <w:r>
-        <w:t xml:space="preserve">Can t we get </w:t>
-      </w:r>
-      <w:proofErr w:type="spellStart"/>
-      <w:r>
-        <w:t>github</w:t>
-      </w:r>
-      <w:proofErr w:type="spellEnd"/>
-      <w:r>
-        <w:t xml:space="preserve"> </w:t>
-      </w:r>
-      <w:proofErr w:type="spellStart"/>
-      <w:r>
-        <w:t>interation</w:t>
-      </w:r>
-      <w:proofErr w:type="spellEnd"/>
-      <w:r>
-        <w:t xml:space="preserve"> and AI like copilot in STS</w:t>
+        <w:t>Can t we get github interation and AI like copilot in STS</w:t>
       </w:r>
     </w:p>
     <w:p>
@@ -2473,7 +2416,7 @@
       <w:r>
         <w:lastRenderedPageBreak/>
         <w:pict w14:anchorId="50BEBBDA">
-          <v:rect id="_x0000_i1184" style="width:0;height:1.5pt" o:hralign="center" o:hrstd="t" o:hr="t" fillcolor="#a0a0a0" stroked="f"/>
+          <v:rect id="_x0000_i1052" style="width:0;height:1.5pt" o:hralign="center" o:hrstd="t" o:hr="t" fillcolor="#a0a0a0" stroked="f"/>
         </w:pict>
       </w:r>
     </w:p>
@@ -2582,7 +2525,7 @@
     <w:p>
       <w:r>
         <w:pict w14:anchorId="40397921">
-          <v:rect id="_x0000_i1185" style="width:0;height:1.5pt" o:hralign="center" o:hrstd="t" o:hr="t" fillcolor="#a0a0a0" stroked="f"/>
+          <v:rect id="_x0000_i1053" style="width:0;height:1.5pt" o:hralign="center" o:hrstd="t" o:hr="t" fillcolor="#a0a0a0" stroked="f"/>
         </w:pict>
       </w:r>
     </w:p>
@@ -2685,19 +2628,14 @@
       </w:r>
     </w:p>
     <w:p>
-      <w:proofErr w:type="gramStart"/>
-      <w:r>
-        <w:t>So</w:t>
-      </w:r>
-      <w:proofErr w:type="gramEnd"/>
-      <w:r>
-        <w:t xml:space="preserve"> you are NOT missing capabilities.</w:t>
+      <w:r>
+        <w:t>So you are NOT missing capabilities.</w:t>
       </w:r>
     </w:p>
     <w:p>
       <w:r>
         <w:pict w14:anchorId="77E8C625">
-          <v:rect id="_x0000_i1186" style="width:0;height:1.5pt" o:hralign="center" o:hrstd="t" o:hr="t" fillcolor="#a0a0a0" stroked="f"/>
+          <v:rect id="_x0000_i1054" style="width:0;height:1.5pt" o:hralign="center" o:hrstd="t" o:hr="t" fillcolor="#a0a0a0" stroked="f"/>
         </w:pict>
       </w:r>
     </w:p>
@@ -2778,7 +2716,7 @@
     <w:p>
       <w:r>
         <w:pict w14:anchorId="38066D82">
-          <v:rect id="_x0000_i1187" style="width:0;height:1.5pt" o:hralign="center" o:hrstd="t" o:hr="t" fillcolor="#a0a0a0" stroked="f"/>
+          <v:rect id="_x0000_i1055" style="width:0;height:1.5pt" o:hralign="center" o:hrstd="t" o:hr="t" fillcolor="#a0a0a0" stroked="f"/>
         </w:pict>
       </w:r>
     </w:p>
@@ -2842,13 +2780,1105 @@
         <w:t xml:space="preserve">faster navigation </w:t>
       </w:r>
     </w:p>
-    <w:p>
-      <w:r>
-        <w:pict w14:anchorId="69A3D5A3">
-          <v:rect id="_x0000_i1188" style="width:0;height:1.5pt" o:hralign="center" o:hrstd="t" o:hr="t" fillcolor="#a0a0a0" stroked="f"/>
+    <w:p/>
+    <w:p/>
+    <w:p>
+      <w:r>
+        <w:t>Choose:</w:t>
+      </w:r>
+    </w:p>
+    <w:p>
+      <w:r>
+        <w:t xml:space="preserve">Spring Boot </w:t>
+      </w:r>
+      <w:r>
+        <w:t>3.5.14</w:t>
+      </w:r>
+    </w:p>
+    <w:p>
+      <w:r>
+        <w:rPr>
+          <w:rFonts w:ascii="Segoe UI Emoji" w:hAnsi="Segoe UI Emoji" w:cs="Segoe UI Emoji"/>
+        </w:rPr>
+        <w:t>✅</w:t>
+      </w:r>
+      <w:r>
+        <w:t xml:space="preserve"> NOT the SNAPSHOT version.</w:t>
+      </w:r>
+    </w:p>
+    <w:p>
+      <w:r>
+        <w:pict w14:anchorId="36870D46">
+          <v:rect id="_x0000_i1136" style="width:0;height:1.5pt" o:hralign="center" o:hrstd="t" o:hr="t" fillcolor="#a0a0a0" stroked="f"/>
         </w:pict>
       </w:r>
     </w:p>
+    <w:p>
+      <w:pPr>
+        <w:rPr>
+          <w:b/>
+          <w:bCs/>
+        </w:rPr>
+      </w:pPr>
+      <w:r>
+        <w:rPr>
+          <w:b/>
+          <w:bCs/>
+        </w:rPr>
+        <w:t>Why avoid SNAPSHOT?</w:t>
+      </w:r>
+    </w:p>
+    <w:p>
+      <w:r>
+        <w:t>SNAPSHOT means:</w:t>
+      </w:r>
+    </w:p>
+    <w:p>
+      <w:pPr>
+        <w:numPr>
+          <w:ilvl w:val="0"/>
+          <w:numId w:val="28"/>
+        </w:numPr>
+      </w:pPr>
+      <w:r>
+        <w:t xml:space="preserve">development/in-progress build </w:t>
+      </w:r>
+    </w:p>
+    <w:p>
+      <w:pPr>
+        <w:numPr>
+          <w:ilvl w:val="0"/>
+          <w:numId w:val="28"/>
+        </w:numPr>
+      </w:pPr>
+      <w:r>
+        <w:t xml:space="preserve">not fully stable </w:t>
+      </w:r>
+    </w:p>
+    <w:p>
+      <w:pPr>
+        <w:numPr>
+          <w:ilvl w:val="0"/>
+          <w:numId w:val="28"/>
+        </w:numPr>
+      </w:pPr>
+      <w:r>
+        <w:t xml:space="preserve">can change </w:t>
+      </w:r>
+    </w:p>
+    <w:p>
+      <w:pPr>
+        <w:numPr>
+          <w:ilvl w:val="0"/>
+          <w:numId w:val="28"/>
+        </w:numPr>
+      </w:pPr>
+      <w:r>
+        <w:t xml:space="preserve">may have bugs/issues </w:t>
+      </w:r>
+    </w:p>
+    <w:p>
+      <w:r>
+        <w:t>Good for framework developers/testing, but not for your resume project.</w:t>
+      </w:r>
+    </w:p>
+    <w:p>
+      <w:r>
+        <w:pict w14:anchorId="7614F7B0">
+          <v:rect id="_x0000_i1137" style="width:0;height:1.5pt" o:hralign="center" o:hrstd="t" o:hr="t" fillcolor="#a0a0a0" stroked="f"/>
+        </w:pict>
+      </w:r>
+    </w:p>
+    <w:p>
+      <w:pPr>
+        <w:rPr>
+          <w:b/>
+          <w:bCs/>
+        </w:rPr>
+      </w:pPr>
+      <w:r>
+        <w:rPr>
+          <w:b/>
+          <w:bCs/>
+        </w:rPr>
+        <w:t>Rule to remember</w:t>
+      </w:r>
+    </w:p>
+    <w:p>
+      <w:pPr>
+        <w:rPr>
+          <w:b/>
+          <w:bCs/>
+        </w:rPr>
+      </w:pPr>
+      <w:r>
+        <w:rPr>
+          <w:rFonts w:ascii="Segoe UI Emoji" w:hAnsi="Segoe UI Emoji" w:cs="Segoe UI Emoji"/>
+          <w:b/>
+          <w:bCs/>
+        </w:rPr>
+        <w:t>✅</w:t>
+      </w:r>
+      <w:r>
+        <w:rPr>
+          <w:b/>
+          <w:bCs/>
+        </w:rPr>
+        <w:t xml:space="preserve"> Stable</w:t>
+      </w:r>
+    </w:p>
+    <w:p>
+      <w:r>
+        <w:t>3.5.14</w:t>
+      </w:r>
+    </w:p>
+    <w:p>
+      <w:pPr>
+        <w:rPr>
+          <w:b/>
+          <w:bCs/>
+        </w:rPr>
+      </w:pPr>
+      <w:r>
+        <w:rPr>
+          <w:rFonts w:ascii="Segoe UI Emoji" w:hAnsi="Segoe UI Emoji" w:cs="Segoe UI Emoji"/>
+          <w:b/>
+          <w:bCs/>
+        </w:rPr>
+        <w:t>❌</w:t>
+      </w:r>
+      <w:r>
+        <w:rPr>
+          <w:b/>
+          <w:bCs/>
+        </w:rPr>
+        <w:t xml:space="preserve"> Avoid</w:t>
+      </w:r>
+    </w:p>
+    <w:p>
+      <w:r>
+        <w:t>3.5.15-SNAPSHOT</w:t>
+      </w:r>
+    </w:p>
+    <w:p>
+      <w:r>
+        <w:pict w14:anchorId="1D6F2329">
+          <v:rect id="_x0000_i1138" style="width:0;height:1.5pt" o:hralign="center" o:hrstd="t" o:hr="t" fillcolor="#a0a0a0" stroked="f"/>
+        </w:pict>
+      </w:r>
+    </w:p>
+    <w:p>
+      <w:r>
+        <w:t>For your project:</w:t>
+      </w:r>
+    </w:p>
+    <w:p>
+      <w:pPr>
+        <w:numPr>
+          <w:ilvl w:val="0"/>
+          <w:numId w:val="29"/>
+        </w:numPr>
+      </w:pPr>
+      <w:r>
+        <w:t xml:space="preserve">Spring Boot → 3.5.14 </w:t>
+      </w:r>
+    </w:p>
+    <w:p>
+      <w:pPr>
+        <w:numPr>
+          <w:ilvl w:val="0"/>
+          <w:numId w:val="29"/>
+        </w:numPr>
+      </w:pPr>
+      <w:r>
+        <w:t xml:space="preserve">Java → 17 </w:t>
+      </w:r>
+    </w:p>
+    <w:p>
+      <w:pPr>
+        <w:numPr>
+          <w:ilvl w:val="0"/>
+          <w:numId w:val="29"/>
+        </w:numPr>
+      </w:pPr>
+      <w:r>
+        <w:t xml:space="preserve">Maven → yes </w:t>
+      </w:r>
+    </w:p>
+    <w:p>
+      <w:r>
+        <w:t xml:space="preserve">Perfect setup </w:t>
+      </w:r>
+      <w:r>
+        <w:rPr>
+          <w:rFonts w:ascii="Segoe UI Emoji" w:hAnsi="Segoe UI Emoji" w:cs="Segoe UI Emoji"/>
+        </w:rPr>
+        <w:t>👍</w:t>
+      </w:r>
+    </w:p>
+    <w:p>
+      <w:r>
+        <w:t>In Spring Initializr:</w:t>
+      </w:r>
+    </w:p>
+    <w:p>
+      <w:pPr>
+        <w:rPr>
+          <w:b/>
+          <w:bCs/>
+        </w:rPr>
+      </w:pPr>
+      <w:r>
+        <w:rPr>
+          <w:rFonts w:ascii="Segoe UI Emoji" w:hAnsi="Segoe UI Emoji" w:cs="Segoe UI Emoji"/>
+          <w:b/>
+          <w:bCs/>
+        </w:rPr>
+        <w:t>✅</w:t>
+      </w:r>
+      <w:r>
+        <w:rPr>
+          <w:b/>
+          <w:bCs/>
+        </w:rPr>
+        <w:t xml:space="preserve"> Artifact</w:t>
+      </w:r>
+    </w:p>
+    <w:p>
+      <w:r>
+        <w:t>is basically your:</w:t>
+      </w:r>
+    </w:p>
+    <w:p>
+      <w:r>
+        <w:t>project name</w:t>
+      </w:r>
+    </w:p>
+    <w:p>
+      <w:r>
+        <w:t>AND also usually becomes:</w:t>
+      </w:r>
+    </w:p>
+    <w:p>
+      <w:pPr>
+        <w:numPr>
+          <w:ilvl w:val="0"/>
+          <w:numId w:val="30"/>
+        </w:numPr>
+      </w:pPr>
+      <w:r>
+        <w:lastRenderedPageBreak/>
+        <w:t xml:space="preserve">jar name </w:t>
+      </w:r>
+    </w:p>
+    <w:p>
+      <w:pPr>
+        <w:numPr>
+          <w:ilvl w:val="0"/>
+          <w:numId w:val="30"/>
+        </w:numPr>
+      </w:pPr>
+      <w:r>
+        <w:t xml:space="preserve">main folder name </w:t>
+      </w:r>
+    </w:p>
+    <w:p>
+      <w:pPr>
+        <w:numPr>
+          <w:ilvl w:val="0"/>
+          <w:numId w:val="30"/>
+        </w:numPr>
+      </w:pPr>
+      <w:r>
+        <w:t xml:space="preserve">Maven project name </w:t>
+      </w:r>
+    </w:p>
+    <w:p>
+      <w:r>
+        <w:pict w14:anchorId="4BA49810">
+          <v:rect id="_x0000_i1139" style="width:0;height:1.5pt" o:hralign="center" o:hrstd="t" o:hr="t" fillcolor="#a0a0a0" stroked="f"/>
+        </w:pict>
+      </w:r>
+    </w:p>
+    <w:p>
+      <w:pPr>
+        <w:rPr>
+          <w:b/>
+          <w:bCs/>
+        </w:rPr>
+      </w:pPr>
+      <w:r>
+        <w:rPr>
+          <w:b/>
+          <w:bCs/>
+        </w:rPr>
+        <w:t>Example for your project</w:t>
+      </w:r>
+    </w:p>
+    <w:p>
+      <w:pPr>
+        <w:rPr>
+          <w:b/>
+          <w:bCs/>
+        </w:rPr>
+      </w:pPr>
+      <w:r>
+        <w:rPr>
+          <w:b/>
+          <w:bCs/>
+        </w:rPr>
+        <w:t>Group</w:t>
+      </w:r>
+    </w:p>
+    <w:p>
+      <w:r>
+        <w:t>com.airline</w:t>
+      </w:r>
+    </w:p>
+    <w:p>
+      <w:pPr>
+        <w:rPr>
+          <w:b/>
+          <w:bCs/>
+        </w:rPr>
+      </w:pPr>
+      <w:r>
+        <w:rPr>
+          <w:b/>
+          <w:bCs/>
+        </w:rPr>
+        <w:t>Artifact</w:t>
+      </w:r>
+    </w:p>
+    <w:p>
+      <w:r>
+        <w:t>flight-disruption-system</w:t>
+      </w:r>
+    </w:p>
+    <w:p>
+      <w:r>
+        <w:t>Then generated package becomes something like:</w:t>
+      </w:r>
+    </w:p>
+    <w:p>
+      <w:r>
+        <w:t>com.airline.flightdisruptionsystem</w:t>
+      </w:r>
+    </w:p>
+    <w:p>
+      <w:r>
+        <w:t>and jar file:</w:t>
+      </w:r>
+    </w:p>
+    <w:p>
+      <w:r>
+        <w:t>flight-disruption-system-0.0.1-SNAPSHOT.jar</w:t>
+      </w:r>
+    </w:p>
+    <w:p>
+      <w:r>
+        <w:pict w14:anchorId="046A7230">
+          <v:rect id="_x0000_i1140" style="width:0;height:1.5pt" o:hralign="center" o:hrstd="t" o:hr="t" fillcolor="#a0a0a0" stroked="f"/>
+        </w:pict>
+      </w:r>
+    </w:p>
+    <w:p>
+      <w:pPr>
+        <w:rPr>
+          <w:b/>
+          <w:bCs/>
+        </w:rPr>
+      </w:pPr>
+      <w:r>
+        <w:rPr>
+          <w:b/>
+          <w:bCs/>
+        </w:rPr>
+        <w:t>Simple understanding</w:t>
+      </w:r>
+    </w:p>
+    <w:tbl>
+      <w:tblPr>
+        <w:tblW w:w="0" w:type="auto"/>
+        <w:tblCellSpacing w:w="15" w:type="dxa"/>
+        <w:tblCellMar>
+          <w:top w:w="15" w:type="dxa"/>
+          <w:left w:w="15" w:type="dxa"/>
+          <w:bottom w:w="15" w:type="dxa"/>
+          <w:right w:w="15" w:type="dxa"/>
+        </w:tblCellMar>
+        <w:tblLook w:val="04A0" w:firstRow="1" w:lastRow="0" w:firstColumn="1" w:lastColumn="0" w:noHBand="0" w:noVBand="1"/>
+      </w:tblPr>
+      <w:tblGrid>
+        <w:gridCol w:w="796"/>
+        <w:gridCol w:w="3315"/>
+      </w:tblGrid>
+      <w:tr>
+        <w:trPr>
+          <w:tblHeader/>
+          <w:tblCellSpacing w:w="15" w:type="dxa"/>
+        </w:trPr>
+        <w:tc>
+          <w:tcPr>
+            <w:tcW w:w="0" w:type="auto"/>
+            <w:vAlign w:val="center"/>
+            <w:hideMark/>
+          </w:tcPr>
+          <w:p>
+            <w:pPr>
+              <w:rPr>
+                <w:b/>
+                <w:bCs/>
+              </w:rPr>
+            </w:pPr>
+            <w:r>
+              <w:rPr>
+                <w:b/>
+                <w:bCs/>
+              </w:rPr>
+              <w:t>Field</w:t>
+            </w:r>
+          </w:p>
+        </w:tc>
+        <w:tc>
+          <w:tcPr>
+            <w:tcW w:w="0" w:type="auto"/>
+            <w:vAlign w:val="center"/>
+            <w:hideMark/>
+          </w:tcPr>
+          <w:p>
+            <w:pPr>
+              <w:rPr>
+                <w:b/>
+                <w:bCs/>
+              </w:rPr>
+            </w:pPr>
+            <w:r>
+              <w:rPr>
+                <w:b/>
+                <w:bCs/>
+              </w:rPr>
+              <w:t>Meaning</w:t>
+            </w:r>
+          </w:p>
+        </w:tc>
+      </w:tr>
+      <w:tr>
+        <w:trPr>
+          <w:tblCellSpacing w:w="15" w:type="dxa"/>
+        </w:trPr>
+        <w:tc>
+          <w:tcPr>
+            <w:tcW w:w="0" w:type="auto"/>
+            <w:vAlign w:val="center"/>
+            <w:hideMark/>
+          </w:tcPr>
+          <w:p>
+            <w:r>
+              <w:t>Group</w:t>
+            </w:r>
+          </w:p>
+        </w:tc>
+        <w:tc>
+          <w:tcPr>
+            <w:tcW w:w="0" w:type="auto"/>
+            <w:vAlign w:val="center"/>
+            <w:hideMark/>
+          </w:tcPr>
+          <w:p>
+            <w:r>
+              <w:t>company/organization/package root</w:t>
+            </w:r>
+          </w:p>
+        </w:tc>
+      </w:tr>
+      <w:tr>
+        <w:trPr>
+          <w:tblCellSpacing w:w="15" w:type="dxa"/>
+        </w:trPr>
+        <w:tc>
+          <w:tcPr>
+            <w:tcW w:w="0" w:type="auto"/>
+            <w:vAlign w:val="center"/>
+            <w:hideMark/>
+          </w:tcPr>
+          <w:p>
+            <w:r>
+              <w:t>Artifact</w:t>
+            </w:r>
+          </w:p>
+        </w:tc>
+        <w:tc>
+          <w:tcPr>
+            <w:tcW w:w="0" w:type="auto"/>
+            <w:vAlign w:val="center"/>
+            <w:hideMark/>
+          </w:tcPr>
+          <w:p>
+            <w:r>
+              <w:t>project name</w:t>
+            </w:r>
+          </w:p>
+        </w:tc>
+      </w:tr>
+      <w:tr>
+        <w:trPr>
+          <w:tblCellSpacing w:w="15" w:type="dxa"/>
+        </w:trPr>
+        <w:tc>
+          <w:tcPr>
+            <w:tcW w:w="0" w:type="auto"/>
+            <w:vAlign w:val="center"/>
+            <w:hideMark/>
+          </w:tcPr>
+          <w:p>
+            <w:r>
+              <w:t>Name</w:t>
+            </w:r>
+          </w:p>
+        </w:tc>
+        <w:tc>
+          <w:tcPr>
+            <w:tcW w:w="0" w:type="auto"/>
+            <w:vAlign w:val="center"/>
+            <w:hideMark/>
+          </w:tcPr>
+          <w:p>
+            <w:r>
+              <w:t>display/project title</w:t>
+            </w:r>
+          </w:p>
+        </w:tc>
+      </w:tr>
+      <w:tr>
+        <w:trPr>
+          <w:tblCellSpacing w:w="15" w:type="dxa"/>
+        </w:trPr>
+        <w:tc>
+          <w:tcPr>
+            <w:tcW w:w="0" w:type="auto"/>
+            <w:vAlign w:val="center"/>
+            <w:hideMark/>
+          </w:tcPr>
+          <w:p>
+            <w:r>
+              <w:t>Package</w:t>
+            </w:r>
+          </w:p>
+        </w:tc>
+        <w:tc>
+          <w:tcPr>
+            <w:tcW w:w="0" w:type="auto"/>
+            <w:vAlign w:val="center"/>
+            <w:hideMark/>
+          </w:tcPr>
+          <w:p>
+            <w:r>
+              <w:t>generated Java package</w:t>
+            </w:r>
+          </w:p>
+        </w:tc>
+      </w:tr>
+    </w:tbl>
+    <w:p>
+      <w:r>
+        <w:pict w14:anchorId="02AB3CC9">
+          <v:rect id="_x0000_i1141" style="width:0;height:1.5pt" o:hralign="center" o:hrstd="t" o:hr="t" fillcolor="#a0a0a0" stroked="f"/>
+        </w:pict>
+      </w:r>
+    </w:p>
+    <w:p>
+      <w:pPr>
+        <w:rPr>
+          <w:b/>
+          <w:bCs/>
+        </w:rPr>
+      </w:pPr>
+      <w:r>
+        <w:rPr>
+          <w:b/>
+          <w:bCs/>
+        </w:rPr>
+        <w:t>Recommended values for you</w:t>
+      </w:r>
+    </w:p>
+    <w:p>
+      <w:pPr>
+        <w:rPr>
+          <w:b/>
+          <w:bCs/>
+        </w:rPr>
+      </w:pPr>
+      <w:r>
+        <w:rPr>
+          <w:b/>
+          <w:bCs/>
+        </w:rPr>
+        <w:t>Group</w:t>
+      </w:r>
+    </w:p>
+    <w:p>
+      <w:r>
+        <w:t>com.airline</w:t>
+      </w:r>
+    </w:p>
+    <w:p>
+      <w:pPr>
+        <w:rPr>
+          <w:b/>
+          <w:bCs/>
+        </w:rPr>
+      </w:pPr>
+      <w:r>
+        <w:rPr>
+          <w:b/>
+          <w:bCs/>
+        </w:rPr>
+        <w:t>Artifact</w:t>
+      </w:r>
+    </w:p>
+    <w:p>
+      <w:r>
+        <w:t>flight-disruption-system</w:t>
+      </w:r>
+    </w:p>
+    <w:p>
+      <w:r>
+        <w:t xml:space="preserve">Nice professional naming for resume/GitHub </w:t>
+      </w:r>
+      <w:r>
+        <w:rPr>
+          <w:rFonts w:ascii="Segoe UI Emoji" w:hAnsi="Segoe UI Emoji" w:cs="Segoe UI Emoji"/>
+        </w:rPr>
+        <w:t>👍</w:t>
+      </w:r>
+    </w:p>
+    <w:p>
+      <w:r>
+        <w:t>dependencies</w:t>
+      </w:r>
+    </w:p>
+    <w:p>
+      <w:r>
+        <w:t>For your airline disruption project, select ONLY these initially. Keep it simple at start.</w:t>
+      </w:r>
+    </w:p>
+    <w:p>
+      <w:pPr>
+        <w:rPr>
+          <w:b/>
+          <w:bCs/>
+        </w:rPr>
+      </w:pPr>
+      <w:r>
+        <w:rPr>
+          <w:rFonts w:ascii="Segoe UI Emoji" w:hAnsi="Segoe UI Emoji" w:cs="Segoe UI Emoji"/>
+          <w:b/>
+          <w:bCs/>
+        </w:rPr>
+        <w:t>✅</w:t>
+      </w:r>
+      <w:r>
+        <w:rPr>
+          <w:b/>
+          <w:bCs/>
+        </w:rPr>
+        <w:t xml:space="preserve"> Select these dependencies</w:t>
+      </w:r>
+    </w:p>
+    <w:p>
+      <w:r>
+        <w:lastRenderedPageBreak/>
+        <w:t>When dependency search opens, add:</w:t>
+      </w:r>
+    </w:p>
+    <w:p>
+      <w:r>
+        <w:pict w14:anchorId="7E4797F9">
+          <v:rect id="_x0000_i1142" style="width:0;height:1.5pt" o:hralign="center" o:hrstd="t" o:hr="t" fillcolor="#a0a0a0" stroked="f"/>
+        </w:pict>
+      </w:r>
+    </w:p>
+    <w:p>
+      <w:pPr>
+        <w:rPr>
+          <w:b/>
+          <w:bCs/>
+        </w:rPr>
+      </w:pPr>
+      <w:r>
+        <w:rPr>
+          <w:b/>
+          <w:bCs/>
+        </w:rPr>
+        <w:t>1. Spring Web</w:t>
+      </w:r>
+    </w:p>
+    <w:p>
+      <w:r>
+        <w:t>For:</w:t>
+      </w:r>
+    </w:p>
+    <w:p>
+      <w:pPr>
+        <w:numPr>
+          <w:ilvl w:val="0"/>
+          <w:numId w:val="31"/>
+        </w:numPr>
+      </w:pPr>
+      <w:r>
+        <w:t xml:space="preserve">REST APIs </w:t>
+      </w:r>
+    </w:p>
+    <w:p>
+      <w:pPr>
+        <w:numPr>
+          <w:ilvl w:val="0"/>
+          <w:numId w:val="31"/>
+        </w:numPr>
+      </w:pPr>
+      <w:r>
+        <w:t xml:space="preserve">controllers </w:t>
+      </w:r>
+    </w:p>
+    <w:p>
+      <w:pPr>
+        <w:numPr>
+          <w:ilvl w:val="0"/>
+          <w:numId w:val="31"/>
+        </w:numPr>
+      </w:pPr>
+      <w:r>
+        <w:t xml:space="preserve">HTTP endpoints </w:t>
+      </w:r>
+    </w:p>
+    <w:p>
+      <w:r>
+        <w:t>Search:</w:t>
+      </w:r>
+    </w:p>
+    <w:p>
+      <w:r>
+        <w:t>Spring Web</w:t>
+      </w:r>
+    </w:p>
+    <w:p>
+      <w:r>
+        <w:pict w14:anchorId="1B9E2B11">
+          <v:rect id="_x0000_i1143" style="width:0;height:1.5pt" o:hralign="center" o:hrstd="t" o:hr="t" fillcolor="#a0a0a0" stroked="f"/>
+        </w:pict>
+      </w:r>
+    </w:p>
+    <w:p>
+      <w:pPr>
+        <w:rPr>
+          <w:b/>
+          <w:bCs/>
+        </w:rPr>
+      </w:pPr>
+      <w:r>
+        <w:rPr>
+          <w:b/>
+          <w:bCs/>
+        </w:rPr>
+        <w:t>2. Spring Data JPA</w:t>
+      </w:r>
+    </w:p>
+    <w:p>
+      <w:r>
+        <w:t>For:</w:t>
+      </w:r>
+    </w:p>
+    <w:p>
+      <w:pPr>
+        <w:numPr>
+          <w:ilvl w:val="0"/>
+          <w:numId w:val="32"/>
+        </w:numPr>
+      </w:pPr>
+      <w:r>
+        <w:t xml:space="preserve">database operations </w:t>
+      </w:r>
+    </w:p>
+    <w:p>
+      <w:pPr>
+        <w:numPr>
+          <w:ilvl w:val="0"/>
+          <w:numId w:val="32"/>
+        </w:numPr>
+      </w:pPr>
+      <w:r>
+        <w:t xml:space="preserve">repositories </w:t>
+      </w:r>
+    </w:p>
+    <w:p>
+      <w:pPr>
+        <w:numPr>
+          <w:ilvl w:val="0"/>
+          <w:numId w:val="32"/>
+        </w:numPr>
+      </w:pPr>
+      <w:r>
+        <w:t xml:space="preserve">entities </w:t>
+      </w:r>
+    </w:p>
+    <w:p>
+      <w:r>
+        <w:t>Search:</w:t>
+      </w:r>
+    </w:p>
+    <w:p>
+      <w:r>
+        <w:t>Spring Data JPA</w:t>
+      </w:r>
+    </w:p>
+    <w:p>
+      <w:r>
+        <w:pict w14:anchorId="1DE6DC1B">
+          <v:rect id="_x0000_i1144" style="width:0;height:1.5pt" o:hralign="center" o:hrstd="t" o:hr="t" fillcolor="#a0a0a0" stroked="f"/>
+        </w:pict>
+      </w:r>
+    </w:p>
+    <w:p>
+      <w:pPr>
+        <w:rPr>
+          <w:b/>
+          <w:bCs/>
+        </w:rPr>
+      </w:pPr>
+      <w:r>
+        <w:rPr>
+          <w:b/>
+          <w:bCs/>
+        </w:rPr>
+        <w:t>3. PostgreSQL Driver</w:t>
+      </w:r>
+    </w:p>
+    <w:p>
+      <w:r>
+        <w:t>For connecting to PostgreSQL DB.</w:t>
+      </w:r>
+    </w:p>
+    <w:p>
+      <w:r>
+        <w:t>Search:</w:t>
+      </w:r>
+    </w:p>
+    <w:p>
+      <w:r>
+        <w:t>PostgreSQL Driver</w:t>
+      </w:r>
+    </w:p>
+    <w:p>
+      <w:r>
+        <w:pict w14:anchorId="3C96C2BD">
+          <v:rect id="_x0000_i1145" style="width:0;height:1.5pt" o:hralign="center" o:hrstd="t" o:hr="t" fillcolor="#a0a0a0" stroked="f"/>
+        </w:pict>
+      </w:r>
+    </w:p>
+    <w:p>
+      <w:pPr>
+        <w:rPr>
+          <w:b/>
+          <w:bCs/>
+        </w:rPr>
+      </w:pPr>
+      <w:r>
+        <w:rPr>
+          <w:b/>
+          <w:bCs/>
+        </w:rPr>
+        <w:t>4. Lombok</w:t>
+      </w:r>
+    </w:p>
+    <w:p>
+      <w:r>
+        <w:t>Reduces boilerplate:</w:t>
+      </w:r>
+    </w:p>
+    <w:p>
+      <w:pPr>
+        <w:numPr>
+          <w:ilvl w:val="0"/>
+          <w:numId w:val="33"/>
+        </w:numPr>
+      </w:pPr>
+      <w:r>
+        <w:t xml:space="preserve">getters/setters </w:t>
+      </w:r>
+    </w:p>
+    <w:p>
+      <w:pPr>
+        <w:numPr>
+          <w:ilvl w:val="0"/>
+          <w:numId w:val="33"/>
+        </w:numPr>
+      </w:pPr>
+      <w:r>
+        <w:t xml:space="preserve">constructors </w:t>
+      </w:r>
+    </w:p>
+    <w:p>
+      <w:pPr>
+        <w:numPr>
+          <w:ilvl w:val="0"/>
+          <w:numId w:val="33"/>
+        </w:numPr>
+      </w:pPr>
+      <w:r>
+        <w:t xml:space="preserve">builders </w:t>
+      </w:r>
+    </w:p>
+    <w:p>
+      <w:r>
+        <w:t>Search:</w:t>
+      </w:r>
+    </w:p>
+    <w:p>
+      <w:r>
+        <w:t>Lombok</w:t>
+      </w:r>
+    </w:p>
+    <w:p>
+      <w:r>
+        <w:pict w14:anchorId="7EB998B5">
+          <v:rect id="_x0000_i1146" style="width:0;height:1.5pt" o:hralign="center" o:hrstd="t" o:hr="t" fillcolor="#a0a0a0" stroked="f"/>
+        </w:pict>
+      </w:r>
+    </w:p>
+    <w:p>
+      <w:pPr>
+        <w:rPr>
+          <w:b/>
+          <w:bCs/>
+        </w:rPr>
+      </w:pPr>
+      <w:r>
+        <w:rPr>
+          <w:b/>
+          <w:bCs/>
+        </w:rPr>
+        <w:lastRenderedPageBreak/>
+        <w:t>5. Validation</w:t>
+      </w:r>
+    </w:p>
+    <w:p>
+      <w:r>
+        <w:t>For request validations:</w:t>
+      </w:r>
+    </w:p>
+    <w:p>
+      <w:r>
+        <w:t>@NotNull</w:t>
+      </w:r>
+      <w:r>
+        <w:br/>
+        <w:t>@Email</w:t>
+      </w:r>
+      <w:r>
+        <w:br/>
+        <w:t>@Size</w:t>
+      </w:r>
+    </w:p>
+    <w:p>
+      <w:r>
+        <w:t>Search:</w:t>
+      </w:r>
+    </w:p>
+    <w:p>
+      <w:r>
+        <w:t>Validation</w:t>
+      </w:r>
+    </w:p>
+    <w:p>
+      <w:r>
+        <w:pict w14:anchorId="312465F8">
+          <v:rect id="_x0000_i1147" style="width:0;height:1.5pt" o:hralign="center" o:hrstd="t" o:hr="t" fillcolor="#a0a0a0" stroked="f"/>
+        </w:pict>
+      </w:r>
+    </w:p>
+    <w:p>
+      <w:pPr>
+        <w:rPr>
+          <w:b/>
+          <w:bCs/>
+        </w:rPr>
+      </w:pPr>
+      <w:r>
+        <w:rPr>
+          <w:b/>
+          <w:bCs/>
+        </w:rPr>
+        <w:t>Final dependency list should look like:</w:t>
+      </w:r>
+    </w:p>
+    <w:p>
+      <w:r>
+        <w:rPr>
+          <w:rFonts w:ascii="Segoe UI Emoji" w:hAnsi="Segoe UI Emoji" w:cs="Segoe UI Emoji"/>
+        </w:rPr>
+        <w:t>✅</w:t>
+      </w:r>
+      <w:r>
+        <w:t xml:space="preserve"> Spring Web</w:t>
+      </w:r>
+      <w:r>
+        <w:br/>
+      </w:r>
+      <w:r>
+        <w:rPr>
+          <w:rFonts w:ascii="Segoe UI Emoji" w:hAnsi="Segoe UI Emoji" w:cs="Segoe UI Emoji"/>
+        </w:rPr>
+        <w:t>✅</w:t>
+      </w:r>
+      <w:r>
+        <w:t xml:space="preserve"> Spring Data JPA</w:t>
+      </w:r>
+      <w:r>
+        <w:br/>
+      </w:r>
+      <w:r>
+        <w:rPr>
+          <w:rFonts w:ascii="Segoe UI Emoji" w:hAnsi="Segoe UI Emoji" w:cs="Segoe UI Emoji"/>
+        </w:rPr>
+        <w:t>✅</w:t>
+      </w:r>
+      <w:r>
+        <w:t xml:space="preserve"> PostgreSQL Driver</w:t>
+      </w:r>
+      <w:r>
+        <w:br/>
+      </w:r>
+      <w:r>
+        <w:rPr>
+          <w:rFonts w:ascii="Segoe UI Emoji" w:hAnsi="Segoe UI Emoji" w:cs="Segoe UI Emoji"/>
+        </w:rPr>
+        <w:t>✅</w:t>
+      </w:r>
+      <w:r>
+        <w:t xml:space="preserve"> Lombok</w:t>
+      </w:r>
+      <w:r>
+        <w:br/>
+      </w:r>
+      <w:r>
+        <w:rPr>
+          <w:rFonts w:ascii="Segoe UI Emoji" w:hAnsi="Segoe UI Emoji" w:cs="Segoe UI Emoji"/>
+        </w:rPr>
+        <w:t>✅</w:t>
+      </w:r>
+      <w:r>
+        <w:t xml:space="preserve"> Validation</w:t>
+      </w:r>
+    </w:p>
+    <w:p>
+      <w:r>
+        <w:pict w14:anchorId="5C68ABA4">
+          <v:rect id="_x0000_i1148" style="width:0;height:1.5pt" o:hralign="center" o:hrstd="t" o:hr="t" fillcolor="#a0a0a0" stroked="f"/>
+        </w:pict>
+      </w:r>
+    </w:p>
+    <w:p/>
     <w:sectPr>
       <w:pgSz w:w="11906" w:h="16838"/>
       <w:pgMar w:top="1440" w:right="1440" w:bottom="1440" w:left="1440" w:header="708" w:footer="708" w:gutter="0"/>
@@ -2861,6 +3891,11 @@
 
 <file path=word/numbering.xml><?xml version="1.0" encoding="utf-8"?>
 <w:numbering xmlns:wpc="http://schemas.microsoft.com/office/word/2010/wordprocessingCanvas" xmlns:cx="http://schemas.microsoft.com/office/drawing/2014/chartex" xmlns:cx1="http://schemas.microsoft.com/office/drawing/2015/9/8/chartex" xmlns:cx2="http://schemas.microsoft.com/office/drawing/2015/10/21/chartex" xmlns:cx3="http://schemas.microsoft.com/office/drawing/2016/5/9/chartex" xmlns:cx4="http://schemas.microsoft.com/office/drawing/2016/5/10/chartex" xmlns:cx5="http://schemas.microsoft.com/office/drawing/2016/5/11/chartex" xmlns:cx6="http://schemas.microsoft.com/office/drawing/2016/5/12/chartex" xmlns:cx7="http://schemas.microsoft.com/office/drawing/2016/5/13/chartex" xmlns:cx8="http://schemas.microsoft.com/office/drawing/2016/5/14/chartex" xmlns:mc="http://schemas.openxmlformats.org/markup-compatibility/2006" xmlns:aink="http://schemas.microsoft.com/office/drawing/2016/ink" xmlns:am3d="http://schemas.microsoft.com/office/drawing/2017/model3d" xmlns:o="urn:schemas-microsoft-com:office:office" xmlns:oel="http://schemas.microsoft.com/office/2019/extlst" xmlns:r="http://schemas.openxmlformats.org/officeDocument/2006/relationships" xmlns:m="http://schemas.openxmlformats.org/officeDocument/2006/math" xmlns:v="urn:schemas-microsoft-com:vml" xmlns:wp14="http://schemas.microsoft.com/office/word/2010/wordprocessingDrawing" xmlns:wp="http://schemas.openxmlformats.org/drawingml/2006/wordprocessingDrawing" xmlns:w10="urn:schemas-microsoft-com:office:word" xmlns:w="http://schemas.openxmlformats.org/wordprocessingml/2006/main" xmlns:w14="http://schemas.microsoft.com/office/word/2010/wordml" xmlns:w15="http://schemas.microsoft.com/office/word/2012/wordml" xmlns:w16cex="http://schemas.microsoft.com/office/word/2018/wordml/cex" xmlns:w16cid="http://schemas.microsoft.com/office/word/2016/wordml/cid" xmlns:w16="http://schemas.microsoft.com/office/word/2018/wordml" xmlns:w16du="http://schemas.microsoft.com/office/word/2023/wordml/word16du" xmlns:w16sdtdh="http://schemas.microsoft.com/office/word/2020/wordml/sdtdatahash" xmlns:w16sdtfl="http://schemas.microsoft.com/office/word/2024/wordml/sdtformatlock" xmlns:w16se="http://schemas.microsoft.com/office/word/2015/wordml/symex" xmlns:wpg="http://schemas.microsoft.com/office/word/2010/wordprocessingGroup" xmlns:wpi="http://schemas.microsoft.com/office/word/2010/wordprocessingInk" xmlns:wne="http://schemas.microsoft.com/office/word/2006/wordml" xmlns:wps="http://schemas.microsoft.com/office/word/2010/wordprocessingShape" mc:Ignorable="w14 w15 w16se w16cid w16 w16cex w16sdtdh w16sdtfl w16du wp14">
+  <w:numPicBullet w:numPicBulletId="0">
+    <w:pict>
+      <v:rect id="_x0000_i1025" style="width:0;height:1.5pt" o:hralign="center" o:bullet="t" o:hrstd="t" o:hr="t" fillcolor="#a0a0a0" stroked="f"/>
+    </w:pict>
+  </w:numPicBullet>
   <w:abstractNum w:abstractNumId="0" w15:restartNumberingAfterBreak="0">
     <w:nsid w:val="01844E57"/>
     <w:multiLevelType w:val="multilevel"/>
@@ -3309,6 +4344,155 @@
     </w:lvl>
   </w:abstractNum>
   <w:abstractNum w:abstractNumId="3" w15:restartNumberingAfterBreak="0">
+    <w:nsid w:val="0DCC0739"/>
+    <w:multiLevelType w:val="multilevel"/>
+    <w:tmpl w:val="8236E214"/>
+    <w:lvl w:ilvl="0">
+      <w:start w:val="1"/>
+      <w:numFmt w:val="bullet"/>
+      <w:lvlText w:val=""/>
+      <w:lvlJc w:val="left"/>
+      <w:pPr>
+        <w:tabs>
+          <w:tab w:val="num" w:pos="720"/>
+        </w:tabs>
+        <w:ind w:left="720" w:hanging="360"/>
+      </w:pPr>
+      <w:rPr>
+        <w:rFonts w:ascii="Symbol" w:hAnsi="Symbol" w:hint="default"/>
+        <w:sz w:val="20"/>
+      </w:rPr>
+    </w:lvl>
+    <w:lvl w:ilvl="1" w:tentative="1">
+      <w:start w:val="1"/>
+      <w:numFmt w:val="bullet"/>
+      <w:lvlText w:val="o"/>
+      <w:lvlJc w:val="left"/>
+      <w:pPr>
+        <w:tabs>
+          <w:tab w:val="num" w:pos="1440"/>
+        </w:tabs>
+        <w:ind w:left="1440" w:hanging="360"/>
+      </w:pPr>
+      <w:rPr>
+        <w:rFonts w:ascii="Courier New" w:hAnsi="Courier New" w:hint="default"/>
+        <w:sz w:val="20"/>
+      </w:rPr>
+    </w:lvl>
+    <w:lvl w:ilvl="2" w:tentative="1">
+      <w:start w:val="1"/>
+      <w:numFmt w:val="bullet"/>
+      <w:lvlText w:val=""/>
+      <w:lvlJc w:val="left"/>
+      <w:pPr>
+        <w:tabs>
+          <w:tab w:val="num" w:pos="2160"/>
+        </w:tabs>
+        <w:ind w:left="2160" w:hanging="360"/>
+      </w:pPr>
+      <w:rPr>
+        <w:rFonts w:ascii="Wingdings" w:hAnsi="Wingdings" w:hint="default"/>
+        <w:sz w:val="20"/>
+      </w:rPr>
+    </w:lvl>
+    <w:lvl w:ilvl="3" w:tentative="1">
+      <w:start w:val="1"/>
+      <w:numFmt w:val="bullet"/>
+      <w:lvlText w:val=""/>
+      <w:lvlJc w:val="left"/>
+      <w:pPr>
+        <w:tabs>
+          <w:tab w:val="num" w:pos="2880"/>
+        </w:tabs>
+        <w:ind w:left="2880" w:hanging="360"/>
+      </w:pPr>
+      <w:rPr>
+        <w:rFonts w:ascii="Wingdings" w:hAnsi="Wingdings" w:hint="default"/>
+        <w:sz w:val="20"/>
+      </w:rPr>
+    </w:lvl>
+    <w:lvl w:ilvl="4" w:tentative="1">
+      <w:start w:val="1"/>
+      <w:numFmt w:val="bullet"/>
+      <w:lvlText w:val=""/>
+      <w:lvlJc w:val="left"/>
+      <w:pPr>
+        <w:tabs>
+          <w:tab w:val="num" w:pos="3600"/>
+        </w:tabs>
+        <w:ind w:left="3600" w:hanging="360"/>
+      </w:pPr>
+      <w:rPr>
+        <w:rFonts w:ascii="Wingdings" w:hAnsi="Wingdings" w:hint="default"/>
+        <w:sz w:val="20"/>
+      </w:rPr>
+    </w:lvl>
+    <w:lvl w:ilvl="5" w:tentative="1">
+      <w:start w:val="1"/>
+      <w:numFmt w:val="bullet"/>
+      <w:lvlText w:val=""/>
+      <w:lvlJc w:val="left"/>
+      <w:pPr>
+        <w:tabs>
+          <w:tab w:val="num" w:pos="4320"/>
+        </w:tabs>
+        <w:ind w:left="4320" w:hanging="360"/>
+      </w:pPr>
+      <w:rPr>
+        <w:rFonts w:ascii="Wingdings" w:hAnsi="Wingdings" w:hint="default"/>
+        <w:sz w:val="20"/>
+      </w:rPr>
+    </w:lvl>
+    <w:lvl w:ilvl="6" w:tentative="1">
+      <w:start w:val="1"/>
+      <w:numFmt w:val="bullet"/>
+      <w:lvlText w:val=""/>
+      <w:lvlJc w:val="left"/>
+      <w:pPr>
+        <w:tabs>
+          <w:tab w:val="num" w:pos="5040"/>
+        </w:tabs>
+        <w:ind w:left="5040" w:hanging="360"/>
+      </w:pPr>
+      <w:rPr>
+        <w:rFonts w:ascii="Wingdings" w:hAnsi="Wingdings" w:hint="default"/>
+        <w:sz w:val="20"/>
+      </w:rPr>
+    </w:lvl>
+    <w:lvl w:ilvl="7" w:tentative="1">
+      <w:start w:val="1"/>
+      <w:numFmt w:val="bullet"/>
+      <w:lvlText w:val=""/>
+      <w:lvlJc w:val="left"/>
+      <w:pPr>
+        <w:tabs>
+          <w:tab w:val="num" w:pos="5760"/>
+        </w:tabs>
+        <w:ind w:left="5760" w:hanging="360"/>
+      </w:pPr>
+      <w:rPr>
+        <w:rFonts w:ascii="Wingdings" w:hAnsi="Wingdings" w:hint="default"/>
+        <w:sz w:val="20"/>
+      </w:rPr>
+    </w:lvl>
+    <w:lvl w:ilvl="8" w:tentative="1">
+      <w:start w:val="1"/>
+      <w:numFmt w:val="bullet"/>
+      <w:lvlText w:val=""/>
+      <w:lvlJc w:val="left"/>
+      <w:pPr>
+        <w:tabs>
+          <w:tab w:val="num" w:pos="6480"/>
+        </w:tabs>
+        <w:ind w:left="6480" w:hanging="360"/>
+      </w:pPr>
+      <w:rPr>
+        <w:rFonts w:ascii="Wingdings" w:hAnsi="Wingdings" w:hint="default"/>
+        <w:sz w:val="20"/>
+      </w:rPr>
+    </w:lvl>
+  </w:abstractNum>
+  <w:abstractNum w:abstractNumId="4" w15:restartNumberingAfterBreak="0">
     <w:nsid w:val="0F706305"/>
     <w:multiLevelType w:val="multilevel"/>
     <w:tmpl w:val="1644821E"/>
@@ -3457,7 +4641,7 @@
       </w:rPr>
     </w:lvl>
   </w:abstractNum>
-  <w:abstractNum w:abstractNumId="4" w15:restartNumberingAfterBreak="0">
+  <w:abstractNum w:abstractNumId="5" w15:restartNumberingAfterBreak="0">
     <w:nsid w:val="12AE5F4F"/>
     <w:multiLevelType w:val="multilevel"/>
     <w:tmpl w:val="6A0CE7F2"/>
@@ -3606,7 +4790,7 @@
       </w:rPr>
     </w:lvl>
   </w:abstractNum>
-  <w:abstractNum w:abstractNumId="5" w15:restartNumberingAfterBreak="0">
+  <w:abstractNum w:abstractNumId="6" w15:restartNumberingAfterBreak="0">
     <w:nsid w:val="16200C24"/>
     <w:multiLevelType w:val="multilevel"/>
     <w:tmpl w:val="E104E9C6"/>
@@ -3755,7 +4939,7 @@
       </w:rPr>
     </w:lvl>
   </w:abstractNum>
-  <w:abstractNum w:abstractNumId="6" w15:restartNumberingAfterBreak="0">
+  <w:abstractNum w:abstractNumId="7" w15:restartNumberingAfterBreak="0">
     <w:nsid w:val="1C477B17"/>
     <w:multiLevelType w:val="multilevel"/>
     <w:tmpl w:val="D43EEF5E"/>
@@ -3904,7 +5088,7 @@
       </w:rPr>
     </w:lvl>
   </w:abstractNum>
-  <w:abstractNum w:abstractNumId="7" w15:restartNumberingAfterBreak="0">
+  <w:abstractNum w:abstractNumId="8" w15:restartNumberingAfterBreak="0">
     <w:nsid w:val="1CE239F7"/>
     <w:multiLevelType w:val="multilevel"/>
     <w:tmpl w:val="DAFA59E8"/>
@@ -4053,7 +5237,7 @@
       </w:rPr>
     </w:lvl>
   </w:abstractNum>
-  <w:abstractNum w:abstractNumId="8" w15:restartNumberingAfterBreak="0">
+  <w:abstractNum w:abstractNumId="9" w15:restartNumberingAfterBreak="0">
     <w:nsid w:val="1D075984"/>
     <w:multiLevelType w:val="multilevel"/>
     <w:tmpl w:val="C97ADF56"/>
@@ -4202,7 +5386,7 @@
       </w:rPr>
     </w:lvl>
   </w:abstractNum>
-  <w:abstractNum w:abstractNumId="9" w15:restartNumberingAfterBreak="0">
+  <w:abstractNum w:abstractNumId="10" w15:restartNumberingAfterBreak="0">
     <w:nsid w:val="1EE15E79"/>
     <w:multiLevelType w:val="multilevel"/>
     <w:tmpl w:val="1270996C"/>
@@ -4351,7 +5535,7 @@
       </w:rPr>
     </w:lvl>
   </w:abstractNum>
-  <w:abstractNum w:abstractNumId="10" w15:restartNumberingAfterBreak="0">
+  <w:abstractNum w:abstractNumId="11" w15:restartNumberingAfterBreak="0">
     <w:nsid w:val="235A655D"/>
     <w:multiLevelType w:val="multilevel"/>
     <w:tmpl w:val="C9729470"/>
@@ -4500,7 +5684,7 @@
       </w:rPr>
     </w:lvl>
   </w:abstractNum>
-  <w:abstractNum w:abstractNumId="11" w15:restartNumberingAfterBreak="0">
+  <w:abstractNum w:abstractNumId="12" w15:restartNumberingAfterBreak="0">
     <w:nsid w:val="2A000C2E"/>
     <w:multiLevelType w:val="multilevel"/>
     <w:tmpl w:val="F028F10A"/>
@@ -4649,7 +5833,156 @@
       </w:rPr>
     </w:lvl>
   </w:abstractNum>
-  <w:abstractNum w:abstractNumId="12" w15:restartNumberingAfterBreak="0">
+  <w:abstractNum w:abstractNumId="13" w15:restartNumberingAfterBreak="0">
+    <w:nsid w:val="2A8727D5"/>
+    <w:multiLevelType w:val="multilevel"/>
+    <w:tmpl w:val="C2A6EA60"/>
+    <w:lvl w:ilvl="0">
+      <w:start w:val="1"/>
+      <w:numFmt w:val="bullet"/>
+      <w:lvlText w:val=""/>
+      <w:lvlJc w:val="left"/>
+      <w:pPr>
+        <w:tabs>
+          <w:tab w:val="num" w:pos="720"/>
+        </w:tabs>
+        <w:ind w:left="720" w:hanging="360"/>
+      </w:pPr>
+      <w:rPr>
+        <w:rFonts w:ascii="Symbol" w:hAnsi="Symbol" w:hint="default"/>
+        <w:sz w:val="20"/>
+      </w:rPr>
+    </w:lvl>
+    <w:lvl w:ilvl="1" w:tentative="1">
+      <w:start w:val="1"/>
+      <w:numFmt w:val="bullet"/>
+      <w:lvlText w:val="o"/>
+      <w:lvlJc w:val="left"/>
+      <w:pPr>
+        <w:tabs>
+          <w:tab w:val="num" w:pos="1440"/>
+        </w:tabs>
+        <w:ind w:left="1440" w:hanging="360"/>
+      </w:pPr>
+      <w:rPr>
+        <w:rFonts w:ascii="Courier New" w:hAnsi="Courier New" w:hint="default"/>
+        <w:sz w:val="20"/>
+      </w:rPr>
+    </w:lvl>
+    <w:lvl w:ilvl="2" w:tentative="1">
+      <w:start w:val="1"/>
+      <w:numFmt w:val="bullet"/>
+      <w:lvlText w:val=""/>
+      <w:lvlJc w:val="left"/>
+      <w:pPr>
+        <w:tabs>
+          <w:tab w:val="num" w:pos="2160"/>
+        </w:tabs>
+        <w:ind w:left="2160" w:hanging="360"/>
+      </w:pPr>
+      <w:rPr>
+        <w:rFonts w:ascii="Wingdings" w:hAnsi="Wingdings" w:hint="default"/>
+        <w:sz w:val="20"/>
+      </w:rPr>
+    </w:lvl>
+    <w:lvl w:ilvl="3" w:tentative="1">
+      <w:start w:val="1"/>
+      <w:numFmt w:val="bullet"/>
+      <w:lvlText w:val=""/>
+      <w:lvlJc w:val="left"/>
+      <w:pPr>
+        <w:tabs>
+          <w:tab w:val="num" w:pos="2880"/>
+        </w:tabs>
+        <w:ind w:left="2880" w:hanging="360"/>
+      </w:pPr>
+      <w:rPr>
+        <w:rFonts w:ascii="Wingdings" w:hAnsi="Wingdings" w:hint="default"/>
+        <w:sz w:val="20"/>
+      </w:rPr>
+    </w:lvl>
+    <w:lvl w:ilvl="4" w:tentative="1">
+      <w:start w:val="1"/>
+      <w:numFmt w:val="bullet"/>
+      <w:lvlText w:val=""/>
+      <w:lvlJc w:val="left"/>
+      <w:pPr>
+        <w:tabs>
+          <w:tab w:val="num" w:pos="3600"/>
+        </w:tabs>
+        <w:ind w:left="3600" w:hanging="360"/>
+      </w:pPr>
+      <w:rPr>
+        <w:rFonts w:ascii="Wingdings" w:hAnsi="Wingdings" w:hint="default"/>
+        <w:sz w:val="20"/>
+      </w:rPr>
+    </w:lvl>
+    <w:lvl w:ilvl="5" w:tentative="1">
+      <w:start w:val="1"/>
+      <w:numFmt w:val="bullet"/>
+      <w:lvlText w:val=""/>
+      <w:lvlJc w:val="left"/>
+      <w:pPr>
+        <w:tabs>
+          <w:tab w:val="num" w:pos="4320"/>
+        </w:tabs>
+        <w:ind w:left="4320" w:hanging="360"/>
+      </w:pPr>
+      <w:rPr>
+        <w:rFonts w:ascii="Wingdings" w:hAnsi="Wingdings" w:hint="default"/>
+        <w:sz w:val="20"/>
+      </w:rPr>
+    </w:lvl>
+    <w:lvl w:ilvl="6" w:tentative="1">
+      <w:start w:val="1"/>
+      <w:numFmt w:val="bullet"/>
+      <w:lvlText w:val=""/>
+      <w:lvlJc w:val="left"/>
+      <w:pPr>
+        <w:tabs>
+          <w:tab w:val="num" w:pos="5040"/>
+        </w:tabs>
+        <w:ind w:left="5040" w:hanging="360"/>
+      </w:pPr>
+      <w:rPr>
+        <w:rFonts w:ascii="Wingdings" w:hAnsi="Wingdings" w:hint="default"/>
+        <w:sz w:val="20"/>
+      </w:rPr>
+    </w:lvl>
+    <w:lvl w:ilvl="7" w:tentative="1">
+      <w:start w:val="1"/>
+      <w:numFmt w:val="bullet"/>
+      <w:lvlText w:val=""/>
+      <w:lvlJc w:val="left"/>
+      <w:pPr>
+        <w:tabs>
+          <w:tab w:val="num" w:pos="5760"/>
+        </w:tabs>
+        <w:ind w:left="5760" w:hanging="360"/>
+      </w:pPr>
+      <w:rPr>
+        <w:rFonts w:ascii="Wingdings" w:hAnsi="Wingdings" w:hint="default"/>
+        <w:sz w:val="20"/>
+      </w:rPr>
+    </w:lvl>
+    <w:lvl w:ilvl="8" w:tentative="1">
+      <w:start w:val="1"/>
+      <w:numFmt w:val="bullet"/>
+      <w:lvlText w:val=""/>
+      <w:lvlJc w:val="left"/>
+      <w:pPr>
+        <w:tabs>
+          <w:tab w:val="num" w:pos="6480"/>
+        </w:tabs>
+        <w:ind w:left="6480" w:hanging="360"/>
+      </w:pPr>
+      <w:rPr>
+        <w:rFonts w:ascii="Wingdings" w:hAnsi="Wingdings" w:hint="default"/>
+        <w:sz w:val="20"/>
+      </w:rPr>
+    </w:lvl>
+  </w:abstractNum>
+  <w:abstractNum w:abstractNumId="14" w15:restartNumberingAfterBreak="0">
     <w:nsid w:val="35496E9F"/>
     <w:multiLevelType w:val="multilevel"/>
     <w:tmpl w:val="20EC525C"/>
@@ -4798,7 +6131,7 @@
       </w:rPr>
     </w:lvl>
   </w:abstractNum>
-  <w:abstractNum w:abstractNumId="13" w15:restartNumberingAfterBreak="0">
+  <w:abstractNum w:abstractNumId="15" w15:restartNumberingAfterBreak="0">
     <w:nsid w:val="35F23B7C"/>
     <w:multiLevelType w:val="multilevel"/>
     <w:tmpl w:val="63AC4A7C"/>
@@ -4947,7 +6280,7 @@
       </w:rPr>
     </w:lvl>
   </w:abstractNum>
-  <w:abstractNum w:abstractNumId="14" w15:restartNumberingAfterBreak="0">
+  <w:abstractNum w:abstractNumId="16" w15:restartNumberingAfterBreak="0">
     <w:nsid w:val="380A2001"/>
     <w:multiLevelType w:val="multilevel"/>
     <w:tmpl w:val="21AC0B5A"/>
@@ -5096,7 +6429,148 @@
       </w:rPr>
     </w:lvl>
   </w:abstractNum>
-  <w:abstractNum w:abstractNumId="15" w15:restartNumberingAfterBreak="0">
+  <w:abstractNum w:abstractNumId="17" w15:restartNumberingAfterBreak="0">
+    <w:nsid w:val="3C177DDA"/>
+    <w:multiLevelType w:val="hybridMultilevel"/>
+    <w:tmpl w:val="D04214E4"/>
+    <w:lvl w:ilvl="0" w:tplc="B9600ECC">
+      <w:start w:val="1"/>
+      <w:numFmt w:val="bullet"/>
+      <w:lvlText w:val=""/>
+      <w:lvlPicBulletId w:val="0"/>
+      <w:lvlJc w:val="left"/>
+      <w:pPr>
+        <w:tabs>
+          <w:tab w:val="num" w:pos="720"/>
+        </w:tabs>
+        <w:ind w:left="720" w:hanging="360"/>
+      </w:pPr>
+      <w:rPr>
+        <w:rFonts w:ascii="Symbol" w:hAnsi="Symbol" w:hint="default"/>
+      </w:rPr>
+    </w:lvl>
+    <w:lvl w:ilvl="1" w:tplc="F90CF806" w:tentative="1">
+      <w:start w:val="1"/>
+      <w:numFmt w:val="bullet"/>
+      <w:lvlText w:val=""/>
+      <w:lvlJc w:val="left"/>
+      <w:pPr>
+        <w:tabs>
+          <w:tab w:val="num" w:pos="1440"/>
+        </w:tabs>
+        <w:ind w:left="1440" w:hanging="360"/>
+      </w:pPr>
+      <w:rPr>
+        <w:rFonts w:ascii="Symbol" w:hAnsi="Symbol" w:hint="default"/>
+      </w:rPr>
+    </w:lvl>
+    <w:lvl w:ilvl="2" w:tplc="BE80DF94" w:tentative="1">
+      <w:start w:val="1"/>
+      <w:numFmt w:val="bullet"/>
+      <w:lvlText w:val=""/>
+      <w:lvlJc w:val="left"/>
+      <w:pPr>
+        <w:tabs>
+          <w:tab w:val="num" w:pos="2160"/>
+        </w:tabs>
+        <w:ind w:left="2160" w:hanging="360"/>
+      </w:pPr>
+      <w:rPr>
+        <w:rFonts w:ascii="Symbol" w:hAnsi="Symbol" w:hint="default"/>
+      </w:rPr>
+    </w:lvl>
+    <w:lvl w:ilvl="3" w:tplc="C0D08272" w:tentative="1">
+      <w:start w:val="1"/>
+      <w:numFmt w:val="bullet"/>
+      <w:lvlText w:val=""/>
+      <w:lvlJc w:val="left"/>
+      <w:pPr>
+        <w:tabs>
+          <w:tab w:val="num" w:pos="2880"/>
+        </w:tabs>
+        <w:ind w:left="2880" w:hanging="360"/>
+      </w:pPr>
+      <w:rPr>
+        <w:rFonts w:ascii="Symbol" w:hAnsi="Symbol" w:hint="default"/>
+      </w:rPr>
+    </w:lvl>
+    <w:lvl w:ilvl="4" w:tplc="B9767ECA" w:tentative="1">
+      <w:start w:val="1"/>
+      <w:numFmt w:val="bullet"/>
+      <w:lvlText w:val=""/>
+      <w:lvlJc w:val="left"/>
+      <w:pPr>
+        <w:tabs>
+          <w:tab w:val="num" w:pos="3600"/>
+        </w:tabs>
+        <w:ind w:left="3600" w:hanging="360"/>
+      </w:pPr>
+      <w:rPr>
+        <w:rFonts w:ascii="Symbol" w:hAnsi="Symbol" w:hint="default"/>
+      </w:rPr>
+    </w:lvl>
+    <w:lvl w:ilvl="5" w:tplc="A746D988" w:tentative="1">
+      <w:start w:val="1"/>
+      <w:numFmt w:val="bullet"/>
+      <w:lvlText w:val=""/>
+      <w:lvlJc w:val="left"/>
+      <w:pPr>
+        <w:tabs>
+          <w:tab w:val="num" w:pos="4320"/>
+        </w:tabs>
+        <w:ind w:left="4320" w:hanging="360"/>
+      </w:pPr>
+      <w:rPr>
+        <w:rFonts w:ascii="Symbol" w:hAnsi="Symbol" w:hint="default"/>
+      </w:rPr>
+    </w:lvl>
+    <w:lvl w:ilvl="6" w:tplc="F10E53EC" w:tentative="1">
+      <w:start w:val="1"/>
+      <w:numFmt w:val="bullet"/>
+      <w:lvlText w:val=""/>
+      <w:lvlJc w:val="left"/>
+      <w:pPr>
+        <w:tabs>
+          <w:tab w:val="num" w:pos="5040"/>
+        </w:tabs>
+        <w:ind w:left="5040" w:hanging="360"/>
+      </w:pPr>
+      <w:rPr>
+        <w:rFonts w:ascii="Symbol" w:hAnsi="Symbol" w:hint="default"/>
+      </w:rPr>
+    </w:lvl>
+    <w:lvl w:ilvl="7" w:tplc="1F36A3F6" w:tentative="1">
+      <w:start w:val="1"/>
+      <w:numFmt w:val="bullet"/>
+      <w:lvlText w:val=""/>
+      <w:lvlJc w:val="left"/>
+      <w:pPr>
+        <w:tabs>
+          <w:tab w:val="num" w:pos="5760"/>
+        </w:tabs>
+        <w:ind w:left="5760" w:hanging="360"/>
+      </w:pPr>
+      <w:rPr>
+        <w:rFonts w:ascii="Symbol" w:hAnsi="Symbol" w:hint="default"/>
+      </w:rPr>
+    </w:lvl>
+    <w:lvl w:ilvl="8" w:tplc="C49AE6AC" w:tentative="1">
+      <w:start w:val="1"/>
+      <w:numFmt w:val="bullet"/>
+      <w:lvlText w:val=""/>
+      <w:lvlJc w:val="left"/>
+      <w:pPr>
+        <w:tabs>
+          <w:tab w:val="num" w:pos="6480"/>
+        </w:tabs>
+        <w:ind w:left="6480" w:hanging="360"/>
+      </w:pPr>
+      <w:rPr>
+        <w:rFonts w:ascii="Symbol" w:hAnsi="Symbol" w:hint="default"/>
+      </w:rPr>
+    </w:lvl>
+  </w:abstractNum>
+  <w:abstractNum w:abstractNumId="18" w15:restartNumberingAfterBreak="0">
     <w:nsid w:val="3D86029B"/>
     <w:multiLevelType w:val="multilevel"/>
     <w:tmpl w:val="4AD2A964"/>
@@ -5245,7 +6719,156 @@
       </w:rPr>
     </w:lvl>
   </w:abstractNum>
-  <w:abstractNum w:abstractNumId="16" w15:restartNumberingAfterBreak="0">
+  <w:abstractNum w:abstractNumId="19" w15:restartNumberingAfterBreak="0">
+    <w:nsid w:val="3E8A6977"/>
+    <w:multiLevelType w:val="multilevel"/>
+    <w:tmpl w:val="A02C4BBA"/>
+    <w:lvl w:ilvl="0">
+      <w:start w:val="1"/>
+      <w:numFmt w:val="bullet"/>
+      <w:lvlText w:val=""/>
+      <w:lvlJc w:val="left"/>
+      <w:pPr>
+        <w:tabs>
+          <w:tab w:val="num" w:pos="720"/>
+        </w:tabs>
+        <w:ind w:left="720" w:hanging="360"/>
+      </w:pPr>
+      <w:rPr>
+        <w:rFonts w:ascii="Symbol" w:hAnsi="Symbol" w:hint="default"/>
+        <w:sz w:val="20"/>
+      </w:rPr>
+    </w:lvl>
+    <w:lvl w:ilvl="1" w:tentative="1">
+      <w:start w:val="1"/>
+      <w:numFmt w:val="bullet"/>
+      <w:lvlText w:val="o"/>
+      <w:lvlJc w:val="left"/>
+      <w:pPr>
+        <w:tabs>
+          <w:tab w:val="num" w:pos="1440"/>
+        </w:tabs>
+        <w:ind w:left="1440" w:hanging="360"/>
+      </w:pPr>
+      <w:rPr>
+        <w:rFonts w:ascii="Courier New" w:hAnsi="Courier New" w:hint="default"/>
+        <w:sz w:val="20"/>
+      </w:rPr>
+    </w:lvl>
+    <w:lvl w:ilvl="2" w:tentative="1">
+      <w:start w:val="1"/>
+      <w:numFmt w:val="bullet"/>
+      <w:lvlText w:val=""/>
+      <w:lvlJc w:val="left"/>
+      <w:pPr>
+        <w:tabs>
+          <w:tab w:val="num" w:pos="2160"/>
+        </w:tabs>
+        <w:ind w:left="2160" w:hanging="360"/>
+      </w:pPr>
+      <w:rPr>
+        <w:rFonts w:ascii="Wingdings" w:hAnsi="Wingdings" w:hint="default"/>
+        <w:sz w:val="20"/>
+      </w:rPr>
+    </w:lvl>
+    <w:lvl w:ilvl="3" w:tentative="1">
+      <w:start w:val="1"/>
+      <w:numFmt w:val="bullet"/>
+      <w:lvlText w:val=""/>
+      <w:lvlJc w:val="left"/>
+      <w:pPr>
+        <w:tabs>
+          <w:tab w:val="num" w:pos="2880"/>
+        </w:tabs>
+        <w:ind w:left="2880" w:hanging="360"/>
+      </w:pPr>
+      <w:rPr>
+        <w:rFonts w:ascii="Wingdings" w:hAnsi="Wingdings" w:hint="default"/>
+        <w:sz w:val="20"/>
+      </w:rPr>
+    </w:lvl>
+    <w:lvl w:ilvl="4" w:tentative="1">
+      <w:start w:val="1"/>
+      <w:numFmt w:val="bullet"/>
+      <w:lvlText w:val=""/>
+      <w:lvlJc w:val="left"/>
+      <w:pPr>
+        <w:tabs>
+          <w:tab w:val="num" w:pos="3600"/>
+        </w:tabs>
+        <w:ind w:left="3600" w:hanging="360"/>
+      </w:pPr>
+      <w:rPr>
+        <w:rFonts w:ascii="Wingdings" w:hAnsi="Wingdings" w:hint="default"/>
+        <w:sz w:val="20"/>
+      </w:rPr>
+    </w:lvl>
+    <w:lvl w:ilvl="5" w:tentative="1">
+      <w:start w:val="1"/>
+      <w:numFmt w:val="bullet"/>
+      <w:lvlText w:val=""/>
+      <w:lvlJc w:val="left"/>
+      <w:pPr>
+        <w:tabs>
+          <w:tab w:val="num" w:pos="4320"/>
+        </w:tabs>
+        <w:ind w:left="4320" w:hanging="360"/>
+      </w:pPr>
+      <w:rPr>
+        <w:rFonts w:ascii="Wingdings" w:hAnsi="Wingdings" w:hint="default"/>
+        <w:sz w:val="20"/>
+      </w:rPr>
+    </w:lvl>
+    <w:lvl w:ilvl="6" w:tentative="1">
+      <w:start w:val="1"/>
+      <w:numFmt w:val="bullet"/>
+      <w:lvlText w:val=""/>
+      <w:lvlJc w:val="left"/>
+      <w:pPr>
+        <w:tabs>
+          <w:tab w:val="num" w:pos="5040"/>
+        </w:tabs>
+        <w:ind w:left="5040" w:hanging="360"/>
+      </w:pPr>
+      <w:rPr>
+        <w:rFonts w:ascii="Wingdings" w:hAnsi="Wingdings" w:hint="default"/>
+        <w:sz w:val="20"/>
+      </w:rPr>
+    </w:lvl>
+    <w:lvl w:ilvl="7" w:tentative="1">
+      <w:start w:val="1"/>
+      <w:numFmt w:val="bullet"/>
+      <w:lvlText w:val=""/>
+      <w:lvlJc w:val="left"/>
+      <w:pPr>
+        <w:tabs>
+          <w:tab w:val="num" w:pos="5760"/>
+        </w:tabs>
+        <w:ind w:left="5760" w:hanging="360"/>
+      </w:pPr>
+      <w:rPr>
+        <w:rFonts w:ascii="Wingdings" w:hAnsi="Wingdings" w:hint="default"/>
+        <w:sz w:val="20"/>
+      </w:rPr>
+    </w:lvl>
+    <w:lvl w:ilvl="8" w:tentative="1">
+      <w:start w:val="1"/>
+      <w:numFmt w:val="bullet"/>
+      <w:lvlText w:val=""/>
+      <w:lvlJc w:val="left"/>
+      <w:pPr>
+        <w:tabs>
+          <w:tab w:val="num" w:pos="6480"/>
+        </w:tabs>
+        <w:ind w:left="6480" w:hanging="360"/>
+      </w:pPr>
+      <w:rPr>
+        <w:rFonts w:ascii="Wingdings" w:hAnsi="Wingdings" w:hint="default"/>
+        <w:sz w:val="20"/>
+      </w:rPr>
+    </w:lvl>
+  </w:abstractNum>
+  <w:abstractNum w:abstractNumId="20" w15:restartNumberingAfterBreak="0">
     <w:nsid w:val="406F2632"/>
     <w:multiLevelType w:val="multilevel"/>
     <w:tmpl w:val="F54ADAF2"/>
@@ -5394,7 +7017,7 @@
       </w:rPr>
     </w:lvl>
   </w:abstractNum>
-  <w:abstractNum w:abstractNumId="17" w15:restartNumberingAfterBreak="0">
+  <w:abstractNum w:abstractNumId="21" w15:restartNumberingAfterBreak="0">
     <w:nsid w:val="4ADE6C22"/>
     <w:multiLevelType w:val="multilevel"/>
     <w:tmpl w:val="2E640BC0"/>
@@ -5543,7 +7166,156 @@
       </w:rPr>
     </w:lvl>
   </w:abstractNum>
-  <w:abstractNum w:abstractNumId="18" w15:restartNumberingAfterBreak="0">
+  <w:abstractNum w:abstractNumId="22" w15:restartNumberingAfterBreak="0">
+    <w:nsid w:val="4BF37ACE"/>
+    <w:multiLevelType w:val="multilevel"/>
+    <w:tmpl w:val="10DC43B2"/>
+    <w:lvl w:ilvl="0">
+      <w:start w:val="1"/>
+      <w:numFmt w:val="bullet"/>
+      <w:lvlText w:val=""/>
+      <w:lvlJc w:val="left"/>
+      <w:pPr>
+        <w:tabs>
+          <w:tab w:val="num" w:pos="720"/>
+        </w:tabs>
+        <w:ind w:left="720" w:hanging="360"/>
+      </w:pPr>
+      <w:rPr>
+        <w:rFonts w:ascii="Symbol" w:hAnsi="Symbol" w:hint="default"/>
+        <w:sz w:val="20"/>
+      </w:rPr>
+    </w:lvl>
+    <w:lvl w:ilvl="1" w:tentative="1">
+      <w:start w:val="1"/>
+      <w:numFmt w:val="bullet"/>
+      <w:lvlText w:val="o"/>
+      <w:lvlJc w:val="left"/>
+      <w:pPr>
+        <w:tabs>
+          <w:tab w:val="num" w:pos="1440"/>
+        </w:tabs>
+        <w:ind w:left="1440" w:hanging="360"/>
+      </w:pPr>
+      <w:rPr>
+        <w:rFonts w:ascii="Courier New" w:hAnsi="Courier New" w:hint="default"/>
+        <w:sz w:val="20"/>
+      </w:rPr>
+    </w:lvl>
+    <w:lvl w:ilvl="2" w:tentative="1">
+      <w:start w:val="1"/>
+      <w:numFmt w:val="bullet"/>
+      <w:lvlText w:val=""/>
+      <w:lvlJc w:val="left"/>
+      <w:pPr>
+        <w:tabs>
+          <w:tab w:val="num" w:pos="2160"/>
+        </w:tabs>
+        <w:ind w:left="2160" w:hanging="360"/>
+      </w:pPr>
+      <w:rPr>
+        <w:rFonts w:ascii="Wingdings" w:hAnsi="Wingdings" w:hint="default"/>
+        <w:sz w:val="20"/>
+      </w:rPr>
+    </w:lvl>
+    <w:lvl w:ilvl="3" w:tentative="1">
+      <w:start w:val="1"/>
+      <w:numFmt w:val="bullet"/>
+      <w:lvlText w:val=""/>
+      <w:lvlJc w:val="left"/>
+      <w:pPr>
+        <w:tabs>
+          <w:tab w:val="num" w:pos="2880"/>
+        </w:tabs>
+        <w:ind w:left="2880" w:hanging="360"/>
+      </w:pPr>
+      <w:rPr>
+        <w:rFonts w:ascii="Wingdings" w:hAnsi="Wingdings" w:hint="default"/>
+        <w:sz w:val="20"/>
+      </w:rPr>
+    </w:lvl>
+    <w:lvl w:ilvl="4" w:tentative="1">
+      <w:start w:val="1"/>
+      <w:numFmt w:val="bullet"/>
+      <w:lvlText w:val=""/>
+      <w:lvlJc w:val="left"/>
+      <w:pPr>
+        <w:tabs>
+          <w:tab w:val="num" w:pos="3600"/>
+        </w:tabs>
+        <w:ind w:left="3600" w:hanging="360"/>
+      </w:pPr>
+      <w:rPr>
+        <w:rFonts w:ascii="Wingdings" w:hAnsi="Wingdings" w:hint="default"/>
+        <w:sz w:val="20"/>
+      </w:rPr>
+    </w:lvl>
+    <w:lvl w:ilvl="5" w:tentative="1">
+      <w:start w:val="1"/>
+      <w:numFmt w:val="bullet"/>
+      <w:lvlText w:val=""/>
+      <w:lvlJc w:val="left"/>
+      <w:pPr>
+        <w:tabs>
+          <w:tab w:val="num" w:pos="4320"/>
+        </w:tabs>
+        <w:ind w:left="4320" w:hanging="360"/>
+      </w:pPr>
+      <w:rPr>
+        <w:rFonts w:ascii="Wingdings" w:hAnsi="Wingdings" w:hint="default"/>
+        <w:sz w:val="20"/>
+      </w:rPr>
+    </w:lvl>
+    <w:lvl w:ilvl="6" w:tentative="1">
+      <w:start w:val="1"/>
+      <w:numFmt w:val="bullet"/>
+      <w:lvlText w:val=""/>
+      <w:lvlJc w:val="left"/>
+      <w:pPr>
+        <w:tabs>
+          <w:tab w:val="num" w:pos="5040"/>
+        </w:tabs>
+        <w:ind w:left="5040" w:hanging="360"/>
+      </w:pPr>
+      <w:rPr>
+        <w:rFonts w:ascii="Wingdings" w:hAnsi="Wingdings" w:hint="default"/>
+        <w:sz w:val="20"/>
+      </w:rPr>
+    </w:lvl>
+    <w:lvl w:ilvl="7" w:tentative="1">
+      <w:start w:val="1"/>
+      <w:numFmt w:val="bullet"/>
+      <w:lvlText w:val=""/>
+      <w:lvlJc w:val="left"/>
+      <w:pPr>
+        <w:tabs>
+          <w:tab w:val="num" w:pos="5760"/>
+        </w:tabs>
+        <w:ind w:left="5760" w:hanging="360"/>
+      </w:pPr>
+      <w:rPr>
+        <w:rFonts w:ascii="Wingdings" w:hAnsi="Wingdings" w:hint="default"/>
+        <w:sz w:val="20"/>
+      </w:rPr>
+    </w:lvl>
+    <w:lvl w:ilvl="8" w:tentative="1">
+      <w:start w:val="1"/>
+      <w:numFmt w:val="bullet"/>
+      <w:lvlText w:val=""/>
+      <w:lvlJc w:val="left"/>
+      <w:pPr>
+        <w:tabs>
+          <w:tab w:val="num" w:pos="6480"/>
+        </w:tabs>
+        <w:ind w:left="6480" w:hanging="360"/>
+      </w:pPr>
+      <w:rPr>
+        <w:rFonts w:ascii="Wingdings" w:hAnsi="Wingdings" w:hint="default"/>
+        <w:sz w:val="20"/>
+      </w:rPr>
+    </w:lvl>
+  </w:abstractNum>
+  <w:abstractNum w:abstractNumId="23" w15:restartNumberingAfterBreak="0">
     <w:nsid w:val="59EE4F79"/>
     <w:multiLevelType w:val="multilevel"/>
     <w:tmpl w:val="46AA581A"/>
@@ -5692,7 +7464,7 @@
       </w:rPr>
     </w:lvl>
   </w:abstractNum>
-  <w:abstractNum w:abstractNumId="19" w15:restartNumberingAfterBreak="0">
+  <w:abstractNum w:abstractNumId="24" w15:restartNumberingAfterBreak="0">
     <w:nsid w:val="5DB36C4E"/>
     <w:multiLevelType w:val="multilevel"/>
     <w:tmpl w:val="8BCA5B66"/>
@@ -5841,7 +7613,7 @@
       </w:rPr>
     </w:lvl>
   </w:abstractNum>
-  <w:abstractNum w:abstractNumId="20" w15:restartNumberingAfterBreak="0">
+  <w:abstractNum w:abstractNumId="25" w15:restartNumberingAfterBreak="0">
     <w:nsid w:val="5E331A6E"/>
     <w:multiLevelType w:val="multilevel"/>
     <w:tmpl w:val="59EC37C2"/>
@@ -5990,7 +7762,156 @@
       </w:rPr>
     </w:lvl>
   </w:abstractNum>
-  <w:abstractNum w:abstractNumId="21" w15:restartNumberingAfterBreak="0">
+  <w:abstractNum w:abstractNumId="26" w15:restartNumberingAfterBreak="0">
+    <w:nsid w:val="63E33A0B"/>
+    <w:multiLevelType w:val="multilevel"/>
+    <w:tmpl w:val="F6E44E38"/>
+    <w:lvl w:ilvl="0">
+      <w:start w:val="1"/>
+      <w:numFmt w:val="bullet"/>
+      <w:lvlText w:val=""/>
+      <w:lvlJc w:val="left"/>
+      <w:pPr>
+        <w:tabs>
+          <w:tab w:val="num" w:pos="720"/>
+        </w:tabs>
+        <w:ind w:left="720" w:hanging="360"/>
+      </w:pPr>
+      <w:rPr>
+        <w:rFonts w:ascii="Symbol" w:hAnsi="Symbol" w:hint="default"/>
+        <w:sz w:val="20"/>
+      </w:rPr>
+    </w:lvl>
+    <w:lvl w:ilvl="1" w:tentative="1">
+      <w:start w:val="1"/>
+      <w:numFmt w:val="bullet"/>
+      <w:lvlText w:val="o"/>
+      <w:lvlJc w:val="left"/>
+      <w:pPr>
+        <w:tabs>
+          <w:tab w:val="num" w:pos="1440"/>
+        </w:tabs>
+        <w:ind w:left="1440" w:hanging="360"/>
+      </w:pPr>
+      <w:rPr>
+        <w:rFonts w:ascii="Courier New" w:hAnsi="Courier New" w:hint="default"/>
+        <w:sz w:val="20"/>
+      </w:rPr>
+    </w:lvl>
+    <w:lvl w:ilvl="2" w:tentative="1">
+      <w:start w:val="1"/>
+      <w:numFmt w:val="bullet"/>
+      <w:lvlText w:val=""/>
+      <w:lvlJc w:val="left"/>
+      <w:pPr>
+        <w:tabs>
+          <w:tab w:val="num" w:pos="2160"/>
+        </w:tabs>
+        <w:ind w:left="2160" w:hanging="360"/>
+      </w:pPr>
+      <w:rPr>
+        <w:rFonts w:ascii="Wingdings" w:hAnsi="Wingdings" w:hint="default"/>
+        <w:sz w:val="20"/>
+      </w:rPr>
+    </w:lvl>
+    <w:lvl w:ilvl="3" w:tentative="1">
+      <w:start w:val="1"/>
+      <w:numFmt w:val="bullet"/>
+      <w:lvlText w:val=""/>
+      <w:lvlJc w:val="left"/>
+      <w:pPr>
+        <w:tabs>
+          <w:tab w:val="num" w:pos="2880"/>
+        </w:tabs>
+        <w:ind w:left="2880" w:hanging="360"/>
+      </w:pPr>
+      <w:rPr>
+        <w:rFonts w:ascii="Wingdings" w:hAnsi="Wingdings" w:hint="default"/>
+        <w:sz w:val="20"/>
+      </w:rPr>
+    </w:lvl>
+    <w:lvl w:ilvl="4" w:tentative="1">
+      <w:start w:val="1"/>
+      <w:numFmt w:val="bullet"/>
+      <w:lvlText w:val=""/>
+      <w:lvlJc w:val="left"/>
+      <w:pPr>
+        <w:tabs>
+          <w:tab w:val="num" w:pos="3600"/>
+        </w:tabs>
+        <w:ind w:left="3600" w:hanging="360"/>
+      </w:pPr>
+      <w:rPr>
+        <w:rFonts w:ascii="Wingdings" w:hAnsi="Wingdings" w:hint="default"/>
+        <w:sz w:val="20"/>
+      </w:rPr>
+    </w:lvl>
+    <w:lvl w:ilvl="5" w:tentative="1">
+      <w:start w:val="1"/>
+      <w:numFmt w:val="bullet"/>
+      <w:lvlText w:val=""/>
+      <w:lvlJc w:val="left"/>
+      <w:pPr>
+        <w:tabs>
+          <w:tab w:val="num" w:pos="4320"/>
+        </w:tabs>
+        <w:ind w:left="4320" w:hanging="360"/>
+      </w:pPr>
+      <w:rPr>
+        <w:rFonts w:ascii="Wingdings" w:hAnsi="Wingdings" w:hint="default"/>
+        <w:sz w:val="20"/>
+      </w:rPr>
+    </w:lvl>
+    <w:lvl w:ilvl="6" w:tentative="1">
+      <w:start w:val="1"/>
+      <w:numFmt w:val="bullet"/>
+      <w:lvlText w:val=""/>
+      <w:lvlJc w:val="left"/>
+      <w:pPr>
+        <w:tabs>
+          <w:tab w:val="num" w:pos="5040"/>
+        </w:tabs>
+        <w:ind w:left="5040" w:hanging="360"/>
+      </w:pPr>
+      <w:rPr>
+        <w:rFonts w:ascii="Wingdings" w:hAnsi="Wingdings" w:hint="default"/>
+        <w:sz w:val="20"/>
+      </w:rPr>
+    </w:lvl>
+    <w:lvl w:ilvl="7" w:tentative="1">
+      <w:start w:val="1"/>
+      <w:numFmt w:val="bullet"/>
+      <w:lvlText w:val=""/>
+      <w:lvlJc w:val="left"/>
+      <w:pPr>
+        <w:tabs>
+          <w:tab w:val="num" w:pos="5760"/>
+        </w:tabs>
+        <w:ind w:left="5760" w:hanging="360"/>
+      </w:pPr>
+      <w:rPr>
+        <w:rFonts w:ascii="Wingdings" w:hAnsi="Wingdings" w:hint="default"/>
+        <w:sz w:val="20"/>
+      </w:rPr>
+    </w:lvl>
+    <w:lvl w:ilvl="8" w:tentative="1">
+      <w:start w:val="1"/>
+      <w:numFmt w:val="bullet"/>
+      <w:lvlText w:val=""/>
+      <w:lvlJc w:val="left"/>
+      <w:pPr>
+        <w:tabs>
+          <w:tab w:val="num" w:pos="6480"/>
+        </w:tabs>
+        <w:ind w:left="6480" w:hanging="360"/>
+      </w:pPr>
+      <w:rPr>
+        <w:rFonts w:ascii="Wingdings" w:hAnsi="Wingdings" w:hint="default"/>
+        <w:sz w:val="20"/>
+      </w:rPr>
+    </w:lvl>
+  </w:abstractNum>
+  <w:abstractNum w:abstractNumId="27" w15:restartNumberingAfterBreak="0">
     <w:nsid w:val="66CC7917"/>
     <w:multiLevelType w:val="multilevel"/>
     <w:tmpl w:val="7E284D5C"/>
@@ -6139,7 +8060,7 @@
       </w:rPr>
     </w:lvl>
   </w:abstractNum>
-  <w:abstractNum w:abstractNumId="22" w15:restartNumberingAfterBreak="0">
+  <w:abstractNum w:abstractNumId="28" w15:restartNumberingAfterBreak="0">
     <w:nsid w:val="6C886E3C"/>
     <w:multiLevelType w:val="multilevel"/>
     <w:tmpl w:val="9160B7C4"/>
@@ -6288,7 +8209,7 @@
       </w:rPr>
     </w:lvl>
   </w:abstractNum>
-  <w:abstractNum w:abstractNumId="23" w15:restartNumberingAfterBreak="0">
+  <w:abstractNum w:abstractNumId="29" w15:restartNumberingAfterBreak="0">
     <w:nsid w:val="6D9A06A1"/>
     <w:multiLevelType w:val="multilevel"/>
     <w:tmpl w:val="0C8460B8"/>
@@ -6437,7 +8358,156 @@
       </w:rPr>
     </w:lvl>
   </w:abstractNum>
-  <w:abstractNum w:abstractNumId="24" w15:restartNumberingAfterBreak="0">
+  <w:abstractNum w:abstractNumId="30" w15:restartNumberingAfterBreak="0">
+    <w:nsid w:val="784F46F5"/>
+    <w:multiLevelType w:val="multilevel"/>
+    <w:tmpl w:val="CF300AD2"/>
+    <w:lvl w:ilvl="0">
+      <w:start w:val="1"/>
+      <w:numFmt w:val="bullet"/>
+      <w:lvlText w:val=""/>
+      <w:lvlJc w:val="left"/>
+      <w:pPr>
+        <w:tabs>
+          <w:tab w:val="num" w:pos="720"/>
+        </w:tabs>
+        <w:ind w:left="720" w:hanging="360"/>
+      </w:pPr>
+      <w:rPr>
+        <w:rFonts w:ascii="Symbol" w:hAnsi="Symbol" w:hint="default"/>
+        <w:sz w:val="20"/>
+      </w:rPr>
+    </w:lvl>
+    <w:lvl w:ilvl="1" w:tentative="1">
+      <w:start w:val="1"/>
+      <w:numFmt w:val="bullet"/>
+      <w:lvlText w:val="o"/>
+      <w:lvlJc w:val="left"/>
+      <w:pPr>
+        <w:tabs>
+          <w:tab w:val="num" w:pos="1440"/>
+        </w:tabs>
+        <w:ind w:left="1440" w:hanging="360"/>
+      </w:pPr>
+      <w:rPr>
+        <w:rFonts w:ascii="Courier New" w:hAnsi="Courier New" w:hint="default"/>
+        <w:sz w:val="20"/>
+      </w:rPr>
+    </w:lvl>
+    <w:lvl w:ilvl="2" w:tentative="1">
+      <w:start w:val="1"/>
+      <w:numFmt w:val="bullet"/>
+      <w:lvlText w:val=""/>
+      <w:lvlJc w:val="left"/>
+      <w:pPr>
+        <w:tabs>
+          <w:tab w:val="num" w:pos="2160"/>
+        </w:tabs>
+        <w:ind w:left="2160" w:hanging="360"/>
+      </w:pPr>
+      <w:rPr>
+        <w:rFonts w:ascii="Wingdings" w:hAnsi="Wingdings" w:hint="default"/>
+        <w:sz w:val="20"/>
+      </w:rPr>
+    </w:lvl>
+    <w:lvl w:ilvl="3" w:tentative="1">
+      <w:start w:val="1"/>
+      <w:numFmt w:val="bullet"/>
+      <w:lvlText w:val=""/>
+      <w:lvlJc w:val="left"/>
+      <w:pPr>
+        <w:tabs>
+          <w:tab w:val="num" w:pos="2880"/>
+        </w:tabs>
+        <w:ind w:left="2880" w:hanging="360"/>
+      </w:pPr>
+      <w:rPr>
+        <w:rFonts w:ascii="Wingdings" w:hAnsi="Wingdings" w:hint="default"/>
+        <w:sz w:val="20"/>
+      </w:rPr>
+    </w:lvl>
+    <w:lvl w:ilvl="4" w:tentative="1">
+      <w:start w:val="1"/>
+      <w:numFmt w:val="bullet"/>
+      <w:lvlText w:val=""/>
+      <w:lvlJc w:val="left"/>
+      <w:pPr>
+        <w:tabs>
+          <w:tab w:val="num" w:pos="3600"/>
+        </w:tabs>
+        <w:ind w:left="3600" w:hanging="360"/>
+      </w:pPr>
+      <w:rPr>
+        <w:rFonts w:ascii="Wingdings" w:hAnsi="Wingdings" w:hint="default"/>
+        <w:sz w:val="20"/>
+      </w:rPr>
+    </w:lvl>
+    <w:lvl w:ilvl="5" w:tentative="1">
+      <w:start w:val="1"/>
+      <w:numFmt w:val="bullet"/>
+      <w:lvlText w:val=""/>
+      <w:lvlJc w:val="left"/>
+      <w:pPr>
+        <w:tabs>
+          <w:tab w:val="num" w:pos="4320"/>
+        </w:tabs>
+        <w:ind w:left="4320" w:hanging="360"/>
+      </w:pPr>
+      <w:rPr>
+        <w:rFonts w:ascii="Wingdings" w:hAnsi="Wingdings" w:hint="default"/>
+        <w:sz w:val="20"/>
+      </w:rPr>
+    </w:lvl>
+    <w:lvl w:ilvl="6" w:tentative="1">
+      <w:start w:val="1"/>
+      <w:numFmt w:val="bullet"/>
+      <w:lvlText w:val=""/>
+      <w:lvlJc w:val="left"/>
+      <w:pPr>
+        <w:tabs>
+          <w:tab w:val="num" w:pos="5040"/>
+        </w:tabs>
+        <w:ind w:left="5040" w:hanging="360"/>
+      </w:pPr>
+      <w:rPr>
+        <w:rFonts w:ascii="Wingdings" w:hAnsi="Wingdings" w:hint="default"/>
+        <w:sz w:val="20"/>
+      </w:rPr>
+    </w:lvl>
+    <w:lvl w:ilvl="7" w:tentative="1">
+      <w:start w:val="1"/>
+      <w:numFmt w:val="bullet"/>
+      <w:lvlText w:val=""/>
+      <w:lvlJc w:val="left"/>
+      <w:pPr>
+        <w:tabs>
+          <w:tab w:val="num" w:pos="5760"/>
+        </w:tabs>
+        <w:ind w:left="5760" w:hanging="360"/>
+      </w:pPr>
+      <w:rPr>
+        <w:rFonts w:ascii="Wingdings" w:hAnsi="Wingdings" w:hint="default"/>
+        <w:sz w:val="20"/>
+      </w:rPr>
+    </w:lvl>
+    <w:lvl w:ilvl="8" w:tentative="1">
+      <w:start w:val="1"/>
+      <w:numFmt w:val="bullet"/>
+      <w:lvlText w:val=""/>
+      <w:lvlJc w:val="left"/>
+      <w:pPr>
+        <w:tabs>
+          <w:tab w:val="num" w:pos="6480"/>
+        </w:tabs>
+        <w:ind w:left="6480" w:hanging="360"/>
+      </w:pPr>
+      <w:rPr>
+        <w:rFonts w:ascii="Wingdings" w:hAnsi="Wingdings" w:hint="default"/>
+        <w:sz w:val="20"/>
+      </w:rPr>
+    </w:lvl>
+  </w:abstractNum>
+  <w:abstractNum w:abstractNumId="31" w15:restartNumberingAfterBreak="0">
     <w:nsid w:val="78BF0C2D"/>
     <w:multiLevelType w:val="multilevel"/>
     <w:tmpl w:val="7F345B04"/>
@@ -6586,7 +8656,156 @@
       </w:rPr>
     </w:lvl>
   </w:abstractNum>
-  <w:abstractNum w:abstractNumId="25" w15:restartNumberingAfterBreak="0">
+  <w:abstractNum w:abstractNumId="32" w15:restartNumberingAfterBreak="0">
+    <w:nsid w:val="7DE81242"/>
+    <w:multiLevelType w:val="multilevel"/>
+    <w:tmpl w:val="3A46EBA8"/>
+    <w:lvl w:ilvl="0">
+      <w:start w:val="1"/>
+      <w:numFmt w:val="bullet"/>
+      <w:lvlText w:val=""/>
+      <w:lvlJc w:val="left"/>
+      <w:pPr>
+        <w:tabs>
+          <w:tab w:val="num" w:pos="720"/>
+        </w:tabs>
+        <w:ind w:left="720" w:hanging="360"/>
+      </w:pPr>
+      <w:rPr>
+        <w:rFonts w:ascii="Symbol" w:hAnsi="Symbol" w:hint="default"/>
+        <w:sz w:val="20"/>
+      </w:rPr>
+    </w:lvl>
+    <w:lvl w:ilvl="1" w:tentative="1">
+      <w:start w:val="1"/>
+      <w:numFmt w:val="bullet"/>
+      <w:lvlText w:val="o"/>
+      <w:lvlJc w:val="left"/>
+      <w:pPr>
+        <w:tabs>
+          <w:tab w:val="num" w:pos="1440"/>
+        </w:tabs>
+        <w:ind w:left="1440" w:hanging="360"/>
+      </w:pPr>
+      <w:rPr>
+        <w:rFonts w:ascii="Courier New" w:hAnsi="Courier New" w:hint="default"/>
+        <w:sz w:val="20"/>
+      </w:rPr>
+    </w:lvl>
+    <w:lvl w:ilvl="2" w:tentative="1">
+      <w:start w:val="1"/>
+      <w:numFmt w:val="bullet"/>
+      <w:lvlText w:val=""/>
+      <w:lvlJc w:val="left"/>
+      <w:pPr>
+        <w:tabs>
+          <w:tab w:val="num" w:pos="2160"/>
+        </w:tabs>
+        <w:ind w:left="2160" w:hanging="360"/>
+      </w:pPr>
+      <w:rPr>
+        <w:rFonts w:ascii="Wingdings" w:hAnsi="Wingdings" w:hint="default"/>
+        <w:sz w:val="20"/>
+      </w:rPr>
+    </w:lvl>
+    <w:lvl w:ilvl="3" w:tentative="1">
+      <w:start w:val="1"/>
+      <w:numFmt w:val="bullet"/>
+      <w:lvlText w:val=""/>
+      <w:lvlJc w:val="left"/>
+      <w:pPr>
+        <w:tabs>
+          <w:tab w:val="num" w:pos="2880"/>
+        </w:tabs>
+        <w:ind w:left="2880" w:hanging="360"/>
+      </w:pPr>
+      <w:rPr>
+        <w:rFonts w:ascii="Wingdings" w:hAnsi="Wingdings" w:hint="default"/>
+        <w:sz w:val="20"/>
+      </w:rPr>
+    </w:lvl>
+    <w:lvl w:ilvl="4" w:tentative="1">
+      <w:start w:val="1"/>
+      <w:numFmt w:val="bullet"/>
+      <w:lvlText w:val=""/>
+      <w:lvlJc w:val="left"/>
+      <w:pPr>
+        <w:tabs>
+          <w:tab w:val="num" w:pos="3600"/>
+        </w:tabs>
+        <w:ind w:left="3600" w:hanging="360"/>
+      </w:pPr>
+      <w:rPr>
+        <w:rFonts w:ascii="Wingdings" w:hAnsi="Wingdings" w:hint="default"/>
+        <w:sz w:val="20"/>
+      </w:rPr>
+    </w:lvl>
+    <w:lvl w:ilvl="5" w:tentative="1">
+      <w:start w:val="1"/>
+      <w:numFmt w:val="bullet"/>
+      <w:lvlText w:val=""/>
+      <w:lvlJc w:val="left"/>
+      <w:pPr>
+        <w:tabs>
+          <w:tab w:val="num" w:pos="4320"/>
+        </w:tabs>
+        <w:ind w:left="4320" w:hanging="360"/>
+      </w:pPr>
+      <w:rPr>
+        <w:rFonts w:ascii="Wingdings" w:hAnsi="Wingdings" w:hint="default"/>
+        <w:sz w:val="20"/>
+      </w:rPr>
+    </w:lvl>
+    <w:lvl w:ilvl="6" w:tentative="1">
+      <w:start w:val="1"/>
+      <w:numFmt w:val="bullet"/>
+      <w:lvlText w:val=""/>
+      <w:lvlJc w:val="left"/>
+      <w:pPr>
+        <w:tabs>
+          <w:tab w:val="num" w:pos="5040"/>
+        </w:tabs>
+        <w:ind w:left="5040" w:hanging="360"/>
+      </w:pPr>
+      <w:rPr>
+        <w:rFonts w:ascii="Wingdings" w:hAnsi="Wingdings" w:hint="default"/>
+        <w:sz w:val="20"/>
+      </w:rPr>
+    </w:lvl>
+    <w:lvl w:ilvl="7" w:tentative="1">
+      <w:start w:val="1"/>
+      <w:numFmt w:val="bullet"/>
+      <w:lvlText w:val=""/>
+      <w:lvlJc w:val="left"/>
+      <w:pPr>
+        <w:tabs>
+          <w:tab w:val="num" w:pos="5760"/>
+        </w:tabs>
+        <w:ind w:left="5760" w:hanging="360"/>
+      </w:pPr>
+      <w:rPr>
+        <w:rFonts w:ascii="Wingdings" w:hAnsi="Wingdings" w:hint="default"/>
+        <w:sz w:val="20"/>
+      </w:rPr>
+    </w:lvl>
+    <w:lvl w:ilvl="8" w:tentative="1">
+      <w:start w:val="1"/>
+      <w:numFmt w:val="bullet"/>
+      <w:lvlText w:val=""/>
+      <w:lvlJc w:val="left"/>
+      <w:pPr>
+        <w:tabs>
+          <w:tab w:val="num" w:pos="6480"/>
+        </w:tabs>
+        <w:ind w:left="6480" w:hanging="360"/>
+      </w:pPr>
+      <w:rPr>
+        <w:rFonts w:ascii="Wingdings" w:hAnsi="Wingdings" w:hint="default"/>
+        <w:sz w:val="20"/>
+      </w:rPr>
+    </w:lvl>
+  </w:abstractNum>
+  <w:abstractNum w:abstractNumId="33" w15:restartNumberingAfterBreak="0">
     <w:nsid w:val="7F425EAC"/>
     <w:multiLevelType w:val="multilevel"/>
     <w:tmpl w:val="615A3784"/>
@@ -6736,52 +8955,52 @@
     </w:lvl>
   </w:abstractNum>
   <w:num w:numId="1" w16cid:durableId="1875654167">
+    <w:abstractNumId w:val="5"/>
+  </w:num>
+  <w:num w:numId="2" w16cid:durableId="184829875">
+    <w:abstractNumId w:val="21"/>
+  </w:num>
+  <w:num w:numId="3" w16cid:durableId="774328519">
+    <w:abstractNumId w:val="28"/>
+  </w:num>
+  <w:num w:numId="4" w16cid:durableId="2031251961">
+    <w:abstractNumId w:val="14"/>
+  </w:num>
+  <w:num w:numId="5" w16cid:durableId="2138180522">
+    <w:abstractNumId w:val="16"/>
+  </w:num>
+  <w:num w:numId="6" w16cid:durableId="2111271264">
+    <w:abstractNumId w:val="18"/>
+  </w:num>
+  <w:num w:numId="7" w16cid:durableId="1892299876">
+    <w:abstractNumId w:val="15"/>
+  </w:num>
+  <w:num w:numId="8" w16cid:durableId="1502114546">
+    <w:abstractNumId w:val="12"/>
+  </w:num>
+  <w:num w:numId="9" w16cid:durableId="411463498">
+    <w:abstractNumId w:val="31"/>
+  </w:num>
+  <w:num w:numId="10" w16cid:durableId="479730549">
+    <w:abstractNumId w:val="27"/>
+  </w:num>
+  <w:num w:numId="11" w16cid:durableId="306514537">
+    <w:abstractNumId w:val="33"/>
+  </w:num>
+  <w:num w:numId="12" w16cid:durableId="412167428">
     <w:abstractNumId w:val="4"/>
   </w:num>
-  <w:num w:numId="2" w16cid:durableId="184829875">
-    <w:abstractNumId w:val="17"/>
-  </w:num>
-  <w:num w:numId="3" w16cid:durableId="774328519">
-    <w:abstractNumId w:val="22"/>
-  </w:num>
-  <w:num w:numId="4" w16cid:durableId="2031251961">
-    <w:abstractNumId w:val="12"/>
-  </w:num>
-  <w:num w:numId="5" w16cid:durableId="2138180522">
-    <w:abstractNumId w:val="14"/>
-  </w:num>
-  <w:num w:numId="6" w16cid:durableId="2111271264">
-    <w:abstractNumId w:val="15"/>
-  </w:num>
-  <w:num w:numId="7" w16cid:durableId="1892299876">
-    <w:abstractNumId w:val="13"/>
-  </w:num>
-  <w:num w:numId="8" w16cid:durableId="1502114546">
-    <w:abstractNumId w:val="11"/>
-  </w:num>
-  <w:num w:numId="9" w16cid:durableId="411463498">
-    <w:abstractNumId w:val="24"/>
-  </w:num>
-  <w:num w:numId="10" w16cid:durableId="479730549">
-    <w:abstractNumId w:val="21"/>
-  </w:num>
-  <w:num w:numId="11" w16cid:durableId="306514537">
-    <w:abstractNumId w:val="25"/>
-  </w:num>
-  <w:num w:numId="12" w16cid:durableId="412167428">
-    <w:abstractNumId w:val="3"/>
-  </w:num>
   <w:num w:numId="13" w16cid:durableId="1329674917">
-    <w:abstractNumId w:val="8"/>
+    <w:abstractNumId w:val="9"/>
   </w:num>
   <w:num w:numId="14" w16cid:durableId="533618080">
     <w:abstractNumId w:val="0"/>
   </w:num>
   <w:num w:numId="15" w16cid:durableId="190729997">
-    <w:abstractNumId w:val="5"/>
+    <w:abstractNumId w:val="6"/>
   </w:num>
   <w:num w:numId="16" w16cid:durableId="1131627674">
-    <w:abstractNumId w:val="20"/>
+    <w:abstractNumId w:val="25"/>
   </w:num>
   <w:num w:numId="17" w16cid:durableId="205989660">
     <w:abstractNumId w:val="1"/>
@@ -6790,28 +9009,52 @@
     <w:abstractNumId w:val="2"/>
   </w:num>
   <w:num w:numId="19" w16cid:durableId="710227014">
-    <w:abstractNumId w:val="9"/>
+    <w:abstractNumId w:val="10"/>
   </w:num>
   <w:num w:numId="20" w16cid:durableId="1274676512">
+    <w:abstractNumId w:val="8"/>
+  </w:num>
+  <w:num w:numId="21" w16cid:durableId="1871990374">
+    <w:abstractNumId w:val="24"/>
+  </w:num>
+  <w:num w:numId="22" w16cid:durableId="1703751246">
+    <w:abstractNumId w:val="29"/>
+  </w:num>
+  <w:num w:numId="23" w16cid:durableId="28341261">
+    <w:abstractNumId w:val="11"/>
+  </w:num>
+  <w:num w:numId="24" w16cid:durableId="534119899">
+    <w:abstractNumId w:val="23"/>
+  </w:num>
+  <w:num w:numId="25" w16cid:durableId="399837308">
+    <w:abstractNumId w:val="20"/>
+  </w:num>
+  <w:num w:numId="26" w16cid:durableId="1396932119">
     <w:abstractNumId w:val="7"/>
   </w:num>
-  <w:num w:numId="21" w16cid:durableId="1871990374">
+  <w:num w:numId="27" w16cid:durableId="2143501569">
+    <w:abstractNumId w:val="17"/>
+  </w:num>
+  <w:num w:numId="28" w16cid:durableId="875459786">
+    <w:abstractNumId w:val="30"/>
+  </w:num>
+  <w:num w:numId="29" w16cid:durableId="140586715">
+    <w:abstractNumId w:val="13"/>
+  </w:num>
+  <w:num w:numId="30" w16cid:durableId="1269049944">
+    <w:abstractNumId w:val="22"/>
+  </w:num>
+  <w:num w:numId="31" w16cid:durableId="1656640316">
+    <w:abstractNumId w:val="3"/>
+  </w:num>
+  <w:num w:numId="32" w16cid:durableId="176888754">
+    <w:abstractNumId w:val="32"/>
+  </w:num>
+  <w:num w:numId="33" w16cid:durableId="1191529946">
     <w:abstractNumId w:val="19"/>
   </w:num>
-  <w:num w:numId="22" w16cid:durableId="1703751246">
-    <w:abstractNumId w:val="23"/>
-  </w:num>
-  <w:num w:numId="23" w16cid:durableId="28341261">
-    <w:abstractNumId w:val="10"/>
-  </w:num>
-  <w:num w:numId="24" w16cid:durableId="534119899">
-    <w:abstractNumId w:val="18"/>
-  </w:num>
-  <w:num w:numId="25" w16cid:durableId="399837308">
-    <w:abstractNumId w:val="16"/>
-  </w:num>
-  <w:num w:numId="26" w16cid:durableId="1396932119">
-    <w:abstractNumId w:val="6"/>
+  <w:num w:numId="34" w16cid:durableId="365640958">
+    <w:abstractNumId w:val="26"/>
   </w:num>
 </w:numbering>
 </file>

</xml_diff>